<commit_message>
Avancement des exercices et évolution du modèle de population.
</commit_message>
<xml_diff>
--- a/Maths/Moteur_RTS_exercices_maths.docx
+++ b/Maths/Moteur_RTS_exercices_maths.docx
@@ -40,10 +40,10 @@
     </w:p>
     <w:p>
       <w:r>
-        <w:t>On considère que chaque lapin donne naissance à 2 petits toutes les semaines</w:t>
-      </w:r>
-      <w:r>
-        <w:t xml:space="preserve"> (tous les 7 jours).</w:t>
+        <w:t>On considère que chaque lapin donne naissance à 2 petits tou</w:t>
+      </w:r>
+      <w:r>
+        <w:t>s les jours.</w:t>
       </w:r>
     </w:p>
     <w:p>
@@ -70,11 +70,9 @@
       <w:r>
         <w:t xml:space="preserve"> et </w:t>
       </w:r>
-      <w:proofErr w:type="spellStart"/>
       <w:r>
         <w:t>dt</w:t>
       </w:r>
-      <w:proofErr w:type="spellEnd"/>
       <w:r>
         <w:t xml:space="preserve"> = 1.</w:t>
       </w:r>
@@ -132,40 +130,29 @@
         <w:rPr>
           <w:vertAlign w:val="superscript"/>
         </w:rPr>
-        <w:t>at</w:t>
-      </w:r>
-      <w:r>
-        <w:rPr>
-          <w:vertAlign w:val="superscript"/>
-        </w:rPr>
+        <w:t xml:space="preserve">at </w:t>
+      </w:r>
+      <w:r>
+        <w:t xml:space="preserve">, </w:t>
+      </w:r>
+      <w:r>
+        <w:t xml:space="preserve">donc </w:t>
+      </w:r>
+      <w:r>
+        <w:t xml:space="preserve">P’(t) = </w:t>
+      </w:r>
+      <w:r>
+        <w:t>K</w:t>
+      </w:r>
+      <w:r>
+        <w:t>×</w:t>
+      </w:r>
+      <w:r>
         <w:t xml:space="preserve"> </w:t>
       </w:r>
       <w:r>
-        <w:t xml:space="preserve">, </w:t>
-      </w:r>
-      <w:r>
-        <w:t xml:space="preserve">donc </w:t>
-      </w:r>
-      <w:r>
-        <w:t xml:space="preserve">P’(t) = </w:t>
-      </w:r>
-      <w:r>
-        <w:t>K</w:t>
-      </w:r>
-      <w:r>
-        <w:t>×</w:t>
-      </w:r>
-      <w:r>
-        <w:t xml:space="preserve"> </w:t>
-      </w:r>
-      <w:proofErr w:type="spellStart"/>
-      <w:r>
-        <w:t>a</w:t>
-      </w:r>
-      <w:r>
-        <w:t>e</w:t>
-      </w:r>
-      <w:proofErr w:type="spellEnd"/>
+        <w:t>ae</w:t>
+      </w:r>
       <w:r>
         <w:rPr>
           <w:vertAlign w:val="superscript"/>
@@ -207,11 +194,881 @@
               <w:rPr>
                 <w:rFonts w:ascii="Cambria Math" w:hAnsi="Cambria Math"/>
               </w:rPr>
+              <m:t>ⅆP</m:t>
+            </m:r>
+          </m:num>
+          <m:den>
+            <m:r>
+              <w:rPr>
+                <w:rFonts w:ascii="Cambria Math" w:hAnsi="Cambria Math"/>
+              </w:rPr>
+              <m:t>ⅆt</m:t>
+            </m:r>
+          </m:den>
+        </m:f>
+      </m:oMath>
+      <w:r>
+        <w:rPr>
+          <w:rFonts w:eastAsiaTheme="minorEastAsia"/>
+        </w:rPr>
+        <w:t xml:space="preserve">  </w:t>
+      </w:r>
+      <w:r>
+        <w:t>= aP</w:t>
+      </w:r>
+      <w:r>
+        <w:t xml:space="preserve"> proposée.</w:t>
+      </w:r>
+    </w:p>
+    <w:p>
+      <w:r>
+        <w:t>Donc la solution proposée est bien solution de</w:t>
+      </w:r>
+      <w:r>
+        <w:t xml:space="preserve"> l’équation.</w:t>
+      </w:r>
+    </w:p>
+    <w:p/>
+    <w:p>
+      <w:r>
+        <w:t>(2) Déterminez la constante K de la solution donnée.</w:t>
+      </w:r>
+    </w:p>
+    <w:p>
+      <w:r>
+        <w:t>Nous savons donc que P</w:t>
+      </w:r>
+      <w:r>
+        <w:t>(0) = 2.</w:t>
+      </w:r>
+    </w:p>
+    <w:p>
+      <w:pPr>
+        <w:rPr>
+          <w:lang w:val="en-US"/>
+        </w:rPr>
+      </w:pPr>
+      <w:r>
+        <w:rPr>
+          <w:lang w:val="en-US"/>
+        </w:rPr>
+        <w:t xml:space="preserve">P(0) = K × e </w:t>
+      </w:r>
+      <w:r>
+        <w:rPr>
+          <w:vertAlign w:val="superscript"/>
+          <w:lang w:val="en-US"/>
+        </w:rPr>
+        <w:t>a × 0</w:t>
+      </w:r>
+      <w:r>
+        <w:rPr>
+          <w:vertAlign w:val="superscript"/>
+          <w:lang w:val="en-US"/>
+        </w:rPr>
+        <w:t xml:space="preserve"> </w:t>
+      </w:r>
+      <w:r>
+        <w:rPr>
+          <w:lang w:val="en-US"/>
+        </w:rPr>
+        <w:sym w:font="Wingdings" w:char="F0F3"/>
+      </w:r>
+      <w:r>
+        <w:rPr>
+          <w:lang w:val="en-US"/>
+        </w:rPr>
+        <w:t xml:space="preserve"> P(0) = K </w:t>
+      </w:r>
+      <w:r>
+        <w:rPr>
+          <w:lang w:val="en-US"/>
+        </w:rPr>
+        <w:t>×</w:t>
+      </w:r>
+      <w:r>
+        <w:rPr>
+          <w:lang w:val="en-US"/>
+        </w:rPr>
+        <w:t xml:space="preserve"> e </w:t>
+      </w:r>
+      <w:r>
+        <w:rPr>
+          <w:vertAlign w:val="superscript"/>
+          <w:lang w:val="en-US"/>
+        </w:rPr>
+        <w:t>0</w:t>
+      </w:r>
+      <w:r>
+        <w:rPr>
+          <w:lang w:val="en-US"/>
+        </w:rPr>
+        <w:t xml:space="preserve"> </w:t>
+      </w:r>
+      <w:r>
+        <w:rPr>
+          <w:lang w:val="en-US"/>
+        </w:rPr>
+        <w:sym w:font="Wingdings" w:char="F0F3"/>
+      </w:r>
+      <w:r>
+        <w:rPr>
+          <w:lang w:val="en-US"/>
+        </w:rPr>
+        <w:t xml:space="preserve"> P(0) = K </w:t>
+      </w:r>
+      <w:r>
+        <w:rPr>
+          <w:lang w:val="en-US"/>
+        </w:rPr>
+        <w:t>×</w:t>
+      </w:r>
+      <w:r>
+        <w:rPr>
+          <w:lang w:val="en-US"/>
+        </w:rPr>
+        <w:t xml:space="preserve"> 1 </w:t>
+      </w:r>
+      <w:r>
+        <w:rPr>
+          <w:lang w:val="en-US"/>
+        </w:rPr>
+        <w:sym w:font="Wingdings" w:char="F0F3"/>
+      </w:r>
+      <w:r>
+        <w:rPr>
+          <w:lang w:val="en-US"/>
+        </w:rPr>
+        <w:t xml:space="preserve"> P(0) = K</w:t>
+      </w:r>
+      <w:r>
+        <w:rPr>
+          <w:lang w:val="en-US"/>
+        </w:rPr>
+        <w:t xml:space="preserve"> </w:t>
+      </w:r>
+      <w:r>
+        <w:rPr>
+          <w:lang w:val="en-US"/>
+        </w:rPr>
+        <w:sym w:font="Wingdings" w:char="F0F3"/>
+      </w:r>
+      <w:r>
+        <w:rPr>
+          <w:lang w:val="en-US"/>
+        </w:rPr>
+        <w:t xml:space="preserve"> K = 2.</w:t>
+      </w:r>
+    </w:p>
+    <w:p>
+      <w:r>
+        <w:t>Dans notre cas, on a d</w:t>
+      </w:r>
+      <w:r>
+        <w:t>onc K = 2.</w:t>
+      </w:r>
+    </w:p>
+    <w:p/>
+    <w:p>
+      <w:r>
+        <w:t>(3) Tracez la solution dans un tableur pour une population initiale de 2 lapins et un taux de reproduction a = 0, 05. On choisira comme unité temporelle le jour (à t = 5, nous sommes au cinquième jour).</w:t>
+      </w:r>
+    </w:p>
+    <w:p>
+      <w:r>
+        <w:t xml:space="preserve">Voir </w:t>
+      </w:r>
+      <w:r>
+        <w:t xml:space="preserve">la </w:t>
+      </w:r>
+      <w:r>
+        <w:t xml:space="preserve">solution </w:t>
+      </w:r>
+      <w:r>
+        <w:t xml:space="preserve">sur le document </w:t>
+      </w:r>
+      <w:r>
+        <w:t>Excel</w:t>
+      </w:r>
+      <w:r>
+        <w:t xml:space="preserve"> associé.</w:t>
+      </w:r>
+    </w:p>
+    <w:p/>
+    <w:p>
+      <w:r>
+        <w:t>(4) Vers quelle valeur tend la population de lapins lorsque le temps devient grand ? Montrez-le à l’aide du graphique. Éventuellement, démontrez-le avec l’expression donnée plus haut.</w:t>
+      </w:r>
+    </w:p>
+    <w:p/>
+    <w:p>
+      <w:r>
+        <w:t>D’après le graphique, la population de lapins va tendre jusqu’à l’infini de façon exponentielle au fur et à mesure du temps.</w:t>
+      </w:r>
+    </w:p>
+    <w:p/>
+    <w:p>
+      <w:r>
+        <w:t>(5) Diminuez le taux de reproduction en prenant par exemple a = 0, 00001. Le comportement de la population change-t-il, lorsque le temps augmente ?</w:t>
+      </w:r>
+    </w:p>
+    <w:p/>
+    <w:p>
+      <w:r>
+        <w:t>Oui, la population n’augmente plus.</w:t>
+      </w:r>
+    </w:p>
+    <w:p/>
+    <w:p>
+      <w:r>
+        <w:t>(6) Ce modèle vous semble-t-il réaliste quant à son comportement ?</w:t>
+      </w:r>
+    </w:p>
+    <w:p/>
+    <w:p>
+      <w:r>
+        <w:t>Non, puisque des variables essentielles comme la mortalité et le système de reproduction de sont pas pris en compte dans le modèle actuel.</w:t>
+      </w:r>
+    </w:p>
+    <w:p/>
+    <w:p>
+      <w:pPr>
+        <w:jc w:val="center"/>
+        <w:rPr>
+          <w:sz w:val="32"/>
+          <w:szCs w:val="32"/>
+          <w:u w:val="single"/>
+        </w:rPr>
+      </w:pPr>
+      <w:r>
+        <w:rPr>
+          <w:sz w:val="32"/>
+          <w:szCs w:val="32"/>
+          <w:u w:val="single"/>
+        </w:rPr>
+        <w:t xml:space="preserve">Systèmes dynamiques – </w:t>
+      </w:r>
+      <w:r>
+        <w:rPr>
+          <w:sz w:val="32"/>
+          <w:szCs w:val="32"/>
+          <w:u w:val="single"/>
+        </w:rPr>
+        <w:t>EDO non linéaires d’ordre 1</w:t>
+      </w:r>
+    </w:p>
+    <w:p>
+      <w:pPr>
+        <w:jc w:val="center"/>
+        <w:rPr>
+          <w:sz w:val="32"/>
+          <w:szCs w:val="32"/>
+          <w:u w:val="single"/>
+        </w:rPr>
+      </w:pPr>
+    </w:p>
+    <w:p>
+      <w:pPr>
+        <w:rPr>
+          <w:sz w:val="28"/>
+          <w:szCs w:val="28"/>
+          <w:u w:val="single"/>
+        </w:rPr>
+      </w:pPr>
+      <w:r>
+        <w:rPr>
+          <w:sz w:val="28"/>
+          <w:szCs w:val="28"/>
+          <w:u w:val="single"/>
+        </w:rPr>
+        <w:t>Amélioration du modèle de population</w:t>
+      </w:r>
+      <w:r>
+        <w:rPr>
+          <w:sz w:val="28"/>
+          <w:szCs w:val="28"/>
+          <w:u w:val="single"/>
+        </w:rPr>
+        <w:t> :</w:t>
+      </w:r>
+    </w:p>
+    <w:p>
+      <w:pPr>
+        <w:rPr>
+          <w:sz w:val="28"/>
+          <w:szCs w:val="28"/>
+          <w:u w:val="single"/>
+        </w:rPr>
+      </w:pPr>
+    </w:p>
+    <w:p>
+      <w:r>
+        <w:t xml:space="preserve">Ajout </w:t>
+      </w:r>
+      <w:r>
+        <w:t xml:space="preserve">de la prise en compte de la mortalité des lapins, avec le modèle de Verhulst :  </w:t>
+      </w:r>
+    </w:p>
+    <w:p>
+      <w:pPr>
+        <w:jc w:val="center"/>
+        <w:rPr>
+          <w:sz w:val="32"/>
+          <w:szCs w:val="32"/>
+        </w:rPr>
+      </w:pPr>
+      <m:oMath>
+        <m:f>
+          <m:fPr>
+            <m:ctrlPr>
+              <w:rPr>
+                <w:rFonts w:ascii="Cambria Math" w:hAnsi="Cambria Math"/>
+                <w:i/>
+                <w:sz w:val="32"/>
+                <w:szCs w:val="32"/>
+              </w:rPr>
+            </m:ctrlPr>
+          </m:fPr>
+          <m:num>
+            <m:r>
+              <w:rPr>
+                <w:rFonts w:ascii="Cambria Math" w:hAnsi="Cambria Math"/>
+                <w:sz w:val="32"/>
+                <w:szCs w:val="32"/>
+              </w:rPr>
+              <m:t>ⅆP</m:t>
+            </m:r>
+          </m:num>
+          <m:den>
+            <m:r>
+              <w:rPr>
+                <w:rFonts w:ascii="Cambria Math" w:hAnsi="Cambria Math"/>
+                <w:sz w:val="32"/>
+                <w:szCs w:val="32"/>
+              </w:rPr>
+              <m:t>ⅆt</m:t>
+            </m:r>
+          </m:den>
+        </m:f>
+      </m:oMath>
+      <w:r>
+        <w:rPr>
+          <w:rFonts w:eastAsiaTheme="minorEastAsia"/>
+          <w:sz w:val="32"/>
+          <w:szCs w:val="32"/>
+        </w:rPr>
+        <w:t xml:space="preserve">  </w:t>
+      </w:r>
+      <w:r>
+        <w:rPr>
+          <w:sz w:val="32"/>
+          <w:szCs w:val="32"/>
+        </w:rPr>
+        <w:t>= aP</w:t>
+      </w:r>
+      <w:r>
+        <w:rPr>
+          <w:sz w:val="32"/>
+          <w:szCs w:val="32"/>
+        </w:rPr>
+        <w:t xml:space="preserve"> – bP²</w:t>
+      </w:r>
+    </w:p>
+    <w:p>
+      <w:pPr>
+        <w:rPr>
+          <w:rFonts w:eastAsiaTheme="minorEastAsia"/>
+          <w:sz w:val="32"/>
+          <w:szCs w:val="32"/>
+        </w:rPr>
+      </w:pPr>
+      <w:r>
+        <w:t>La solution du modèle est la suivante :</w:t>
+      </w:r>
+      <w:r>
+        <w:t xml:space="preserve"> </w:t>
+      </w:r>
+      <w:r>
+        <w:rPr>
+          <w:sz w:val="32"/>
+          <w:szCs w:val="32"/>
+        </w:rPr>
+        <w:t xml:space="preserve">P(t) =  </w:t>
+      </w:r>
+      <m:oMath>
+        <m:f>
+          <m:fPr>
+            <m:ctrlPr>
+              <w:rPr>
+                <w:rFonts w:ascii="Cambria Math" w:hAnsi="Cambria Math"/>
+                <w:i/>
+                <w:sz w:val="32"/>
+                <w:szCs w:val="32"/>
+              </w:rPr>
+            </m:ctrlPr>
+          </m:fPr>
+          <m:num>
+            <m:r>
+              <w:rPr>
+                <w:rFonts w:ascii="Cambria Math" w:hAnsi="Cambria Math"/>
+                <w:sz w:val="32"/>
+                <w:szCs w:val="32"/>
+              </w:rPr>
+              <m:t>K</m:t>
+            </m:r>
+          </m:num>
+          <m:den>
+            <m:r>
+              <w:rPr>
+                <w:rFonts w:ascii="Cambria Math" w:hAnsi="Cambria Math"/>
+                <w:sz w:val="32"/>
+                <w:szCs w:val="32"/>
+              </w:rPr>
+              <m:t xml:space="preserve">1+ </m:t>
+            </m:r>
+            <m:f>
+              <m:fPr>
+                <m:ctrlPr>
+                  <w:rPr>
+                    <w:rFonts w:ascii="Cambria Math" w:hAnsi="Cambria Math"/>
+                    <w:i/>
+                    <w:sz w:val="32"/>
+                    <w:szCs w:val="32"/>
+                  </w:rPr>
+                </m:ctrlPr>
+              </m:fPr>
+              <m:num>
+                <m:r>
+                  <w:rPr>
+                    <w:rFonts w:ascii="Cambria Math" w:hAnsi="Cambria Math"/>
+                    <w:sz w:val="32"/>
+                    <w:szCs w:val="32"/>
+                  </w:rPr>
+                  <m:t>K</m:t>
+                </m:r>
+                <m:r>
+                  <w:rPr>
+                    <w:rFonts w:ascii="Cambria Math" w:hAnsi="Cambria Math"/>
+                    <w:sz w:val="32"/>
+                    <w:szCs w:val="32"/>
+                  </w:rPr>
+                  <m:t>-P0</m:t>
+                </m:r>
+              </m:num>
+              <m:den>
+                <m:r>
+                  <w:rPr>
+                    <w:rFonts w:ascii="Cambria Math" w:hAnsi="Cambria Math"/>
+                    <w:sz w:val="32"/>
+                    <w:szCs w:val="32"/>
+                  </w:rPr>
+                  <m:t>P0</m:t>
+                </m:r>
+              </m:den>
+            </m:f>
+            <m:r>
+              <m:rPr>
+                <m:sty m:val="p"/>
+              </m:rPr>
+              <w:rPr>
+                <w:rFonts w:ascii="Cambria Math" w:hAnsi="Cambria Math"/>
+                <w:lang w:val="en-US"/>
+              </w:rPr>
+              <m:t>×</m:t>
+            </m:r>
+            <m:sSup>
+              <m:sSupPr>
+                <m:ctrlPr>
+                  <w:rPr>
+                    <w:rFonts w:ascii="Cambria Math" w:hAnsi="Cambria Math"/>
+                  </w:rPr>
+                </m:ctrlPr>
+              </m:sSupPr>
+              <m:e>
+                <m:r>
+                  <m:rPr>
+                    <m:sty m:val="p"/>
+                  </m:rPr>
+                  <w:rPr>
+                    <w:rFonts w:ascii="Cambria Math" w:hAnsi="Cambria Math"/>
+                  </w:rPr>
+                  <m:t>ⅇ</m:t>
+                </m:r>
+              </m:e>
+              <m:sup>
+                <m:r>
+                  <m:rPr>
+                    <m:sty m:val="p"/>
+                  </m:rPr>
+                  <w:rPr>
+                    <w:rFonts w:ascii="Cambria Math" w:hAnsi="Cambria Math"/>
+                  </w:rPr>
+                  <m:t>-at</m:t>
+                </m:r>
+              </m:sup>
+            </m:sSup>
+            <m:r>
+              <w:rPr>
+                <w:rFonts w:ascii="Cambria Math" w:hAnsi="Cambria Math"/>
+                <w:sz w:val="32"/>
+                <w:szCs w:val="32"/>
+              </w:rPr>
+              <m:t xml:space="preserve">  </m:t>
+            </m:r>
+          </m:den>
+        </m:f>
+      </m:oMath>
+    </w:p>
+    <w:p>
+      <w:pPr>
+        <w:rPr>
+          <w:rFonts w:eastAsiaTheme="minorEastAsia"/>
+          <w:sz w:val="32"/>
+          <w:szCs w:val="32"/>
+        </w:rPr>
+      </w:pPr>
+    </w:p>
+    <w:p>
+      <w:r>
+        <w:t>(1) Tracez la solution dans un tableur pour une population initiale de 2 lapins, un taux de reproduction a = 0, 05 et de mortalité b = 0, 01.</w:t>
+      </w:r>
+    </w:p>
+    <w:p/>
+    <w:p>
+      <w:r>
+        <w:t xml:space="preserve">Voir </w:t>
+      </w:r>
+      <w:r>
+        <w:t xml:space="preserve">la </w:t>
+      </w:r>
+      <w:r>
+        <w:t>solution sur le document Excel associé.</w:t>
+      </w:r>
+    </w:p>
+    <w:p/>
+    <w:p>
+      <w:r>
+        <w:lastRenderedPageBreak/>
+        <w:t>(2) Vers quelle valeur la population s’établit-elle à l’équilibre ?</w:t>
+      </w:r>
+    </w:p>
+    <w:p/>
+    <w:p>
+      <w:r>
+        <w:t>La population s’établie à l’équilibre autour de K.</w:t>
+      </w:r>
+    </w:p>
+    <w:p/>
+    <w:p>
+      <w:r>
+        <w:t>(3) Cette population d’équilibre change-t-elle pour d’autres valeurs de a et de b ? est-ce cohérent ?</w:t>
+      </w:r>
+    </w:p>
+    <w:p>
+      <w:r>
+        <w:t>Oui, la population d’équilibre change pour d’autres valeurs de reproduction et de mortalité. Oui, c’est cohérent puisqu’elle tend automatiquement vers la nouvelle valeur de K.</w:t>
+      </w:r>
+    </w:p>
+    <w:p/>
+    <w:p>
+      <w:r>
+        <w:t>(4) Optionnel : à partir de la population à l’équilibre constatée pour différentes valeurs de a et de b, pouvez-vous intuiter une expression de la population à l’équilibre ?</w:t>
+      </w:r>
+    </w:p>
+    <w:p/>
+    <w:p>
+      <w:r>
+        <w:t xml:space="preserve">Avec ce qui vient d’être constaté, nous pouvons dire qu’une expression de la population à l’équilibre est : Pe = K = </w:t>
+      </w:r>
+      <m:oMath>
+        <m:f>
+          <m:fPr>
+            <m:ctrlPr>
+              <w:rPr>
+                <w:rFonts w:ascii="Cambria Math" w:hAnsi="Cambria Math"/>
+                <w:i/>
+                <w:sz w:val="32"/>
+                <w:szCs w:val="32"/>
+              </w:rPr>
+            </m:ctrlPr>
+          </m:fPr>
+          <m:num>
+            <m:r>
+              <w:rPr>
+                <w:rFonts w:ascii="Cambria Math" w:hAnsi="Cambria Math"/>
+                <w:sz w:val="32"/>
+                <w:szCs w:val="32"/>
+              </w:rPr>
+              <m:t>a</m:t>
+            </m:r>
+          </m:num>
+          <m:den>
+            <m:r>
+              <w:rPr>
+                <w:rFonts w:ascii="Cambria Math" w:hAnsi="Cambria Math"/>
+                <w:sz w:val="32"/>
+                <w:szCs w:val="32"/>
+              </w:rPr>
+              <m:t>b</m:t>
+            </m:r>
+          </m:den>
+        </m:f>
+      </m:oMath>
+      <w:r>
+        <w:rPr>
+          <w:rFonts w:eastAsiaTheme="minorEastAsia"/>
+          <w:sz w:val="32"/>
+          <w:szCs w:val="32"/>
+        </w:rPr>
+        <w:t>.</w:t>
+      </w:r>
+    </w:p>
+    <w:p/>
+    <w:p>
+      <w:pPr>
+        <w:jc w:val="center"/>
+        <w:rPr>
+          <w:sz w:val="32"/>
+          <w:szCs w:val="32"/>
+          <w:u w:val="single"/>
+        </w:rPr>
+      </w:pPr>
+      <w:r>
+        <w:rPr>
+          <w:sz w:val="32"/>
+          <w:szCs w:val="32"/>
+          <w:u w:val="single"/>
+        </w:rPr>
+        <w:t xml:space="preserve">Systèmes dynamiques – </w:t>
+      </w:r>
+      <w:r>
+        <w:rPr>
+          <w:sz w:val="32"/>
+          <w:szCs w:val="32"/>
+          <w:u w:val="single"/>
+        </w:rPr>
+        <w:t>Étude des états d’équilibre</w:t>
+      </w:r>
+    </w:p>
+    <w:p>
+      <w:pPr>
+        <w:jc w:val="center"/>
+        <w:rPr>
+          <w:sz w:val="32"/>
+          <w:szCs w:val="32"/>
+          <w:u w:val="single"/>
+        </w:rPr>
+      </w:pPr>
+    </w:p>
+    <w:p>
+      <w:pPr>
+        <w:rPr>
+          <w:sz w:val="28"/>
+          <w:szCs w:val="28"/>
+          <w:u w:val="single"/>
+        </w:rPr>
+      </w:pPr>
+      <w:r>
+        <w:rPr>
+          <w:sz w:val="28"/>
+          <w:szCs w:val="28"/>
+          <w:u w:val="single"/>
+        </w:rPr>
+        <w:t>Équilibre statique</w:t>
+      </w:r>
+      <w:r>
+        <w:rPr>
+          <w:sz w:val="28"/>
+          <w:szCs w:val="28"/>
+          <w:u w:val="single"/>
+        </w:rPr>
+        <w:t> :</w:t>
+      </w:r>
+    </w:p>
+    <w:p>
+      <w:pPr>
+        <w:rPr>
+          <w:sz w:val="28"/>
+          <w:szCs w:val="28"/>
+          <w:u w:val="single"/>
+        </w:rPr>
+      </w:pPr>
+    </w:p>
+    <w:p>
+      <w:r>
+        <w:t>On dit que la population a atteint un équilibre statique lorsqu’elle ne varie plus dans le temps. Autrement dit, la variation de la population P est nulle :</w:t>
+      </w:r>
+      <w:r>
+        <w:t xml:space="preserve"> </w:t>
+      </w:r>
+      <m:oMath>
+        <m:f>
+          <m:fPr>
+            <m:ctrlPr>
+              <w:rPr>
+                <w:rFonts w:ascii="Cambria Math" w:hAnsi="Cambria Math"/>
+                <w:i/>
+                <w:sz w:val="32"/>
+                <w:szCs w:val="32"/>
+              </w:rPr>
+            </m:ctrlPr>
+          </m:fPr>
+          <m:num>
+            <m:r>
+              <w:rPr>
+                <w:rFonts w:ascii="Cambria Math" w:hAnsi="Cambria Math"/>
+                <w:sz w:val="32"/>
+                <w:szCs w:val="32"/>
+              </w:rPr>
+              <m:t>ⅆP</m:t>
+            </m:r>
+          </m:num>
+          <m:den>
+            <m:r>
+              <w:rPr>
+                <w:rFonts w:ascii="Cambria Math" w:hAnsi="Cambria Math"/>
+                <w:sz w:val="32"/>
+                <w:szCs w:val="32"/>
+              </w:rPr>
+              <m:t>ⅆt</m:t>
+            </m:r>
+          </m:den>
+        </m:f>
+      </m:oMath>
+      <w:r>
+        <w:rPr>
+          <w:rFonts w:eastAsiaTheme="minorEastAsia"/>
+          <w:sz w:val="32"/>
+          <w:szCs w:val="32"/>
+        </w:rPr>
+        <w:t xml:space="preserve">  </w:t>
+      </w:r>
+      <w:r>
+        <w:rPr>
+          <w:sz w:val="32"/>
+          <w:szCs w:val="32"/>
+        </w:rPr>
+        <w:t>=</w:t>
+      </w:r>
+      <w:r>
+        <w:rPr>
+          <w:sz w:val="32"/>
+          <w:szCs w:val="32"/>
+        </w:rPr>
+        <w:t xml:space="preserve"> 0</w:t>
+      </w:r>
+    </w:p>
+    <w:p>
+      <w:pPr>
+        <w:rPr>
+          <w:sz w:val="28"/>
+          <w:szCs w:val="28"/>
+          <w:u w:val="single"/>
+        </w:rPr>
+      </w:pPr>
+    </w:p>
+    <w:p>
+      <w:r>
+        <w:t>(1) En reprenant le premier modèle, quels sont ses états d’équilibre statiques ?</w:t>
+      </w:r>
+    </w:p>
+    <w:p/>
+    <w:p>
+      <w:r>
+        <w:t xml:space="preserve">On cherche donc une valeur pour que </w:t>
+      </w:r>
+      <m:oMath>
+        <m:f>
+          <m:fPr>
+            <m:ctrlPr>
+              <w:rPr>
+                <w:rFonts w:ascii="Cambria Math" w:hAnsi="Cambria Math"/>
+                <w:i/>
+                <w:sz w:val="32"/>
+                <w:szCs w:val="32"/>
+              </w:rPr>
+            </m:ctrlPr>
+          </m:fPr>
+          <m:num>
+            <m:r>
+              <w:rPr>
+                <w:rFonts w:ascii="Cambria Math" w:hAnsi="Cambria Math"/>
+                <w:sz w:val="32"/>
+                <w:szCs w:val="32"/>
+              </w:rPr>
+              <m:t>ⅆP</m:t>
+            </m:r>
+          </m:num>
+          <m:den>
+            <m:r>
+              <w:rPr>
+                <w:rFonts w:ascii="Cambria Math" w:hAnsi="Cambria Math"/>
+                <w:sz w:val="32"/>
+                <w:szCs w:val="32"/>
+              </w:rPr>
+              <m:t>ⅆt</m:t>
+            </m:r>
+          </m:den>
+        </m:f>
+      </m:oMath>
+      <w:r>
+        <w:rPr>
+          <w:rFonts w:eastAsiaTheme="minorEastAsia"/>
+          <w:sz w:val="32"/>
+          <w:szCs w:val="32"/>
+        </w:rPr>
+        <w:t xml:space="preserve">  </w:t>
+      </w:r>
+      <w:r>
+        <w:rPr>
+          <w:sz w:val="32"/>
+          <w:szCs w:val="32"/>
+        </w:rPr>
+        <w:t>=</w:t>
+      </w:r>
+      <w:r>
+        <w:rPr>
+          <w:sz w:val="32"/>
+          <w:szCs w:val="32"/>
+        </w:rPr>
+        <w:t xml:space="preserve"> 0</w:t>
+      </w:r>
+    </w:p>
+    <w:p>
+      <w:pPr>
+        <w:rPr>
+          <w:sz w:val="32"/>
+          <w:szCs w:val="32"/>
+          <w:lang w:val="en-US"/>
+        </w:rPr>
+      </w:pPr>
+      <m:oMath>
+        <m:f>
+          <m:fPr>
+            <m:ctrlPr>
+              <w:rPr>
+                <w:rFonts w:ascii="Cambria Math" w:hAnsi="Cambria Math"/>
+                <w:i/>
+                <w:sz w:val="32"/>
+                <w:szCs w:val="32"/>
+              </w:rPr>
+            </m:ctrlPr>
+          </m:fPr>
+          <m:num>
+            <m:r>
+              <w:rPr>
+                <w:rFonts w:ascii="Cambria Math" w:hAnsi="Cambria Math"/>
+                <w:sz w:val="32"/>
+                <w:szCs w:val="32"/>
+                <w:lang w:val="en-US"/>
+              </w:rPr>
               <m:t>ⅆ</m:t>
             </m:r>
             <m:r>
               <w:rPr>
                 <w:rFonts w:ascii="Cambria Math" w:hAnsi="Cambria Math"/>
+                <w:sz w:val="32"/>
+                <w:szCs w:val="32"/>
               </w:rPr>
               <m:t>P</m:t>
             </m:r>
@@ -220,8 +1077,19 @@
             <m:r>
               <w:rPr>
                 <w:rFonts w:ascii="Cambria Math" w:hAnsi="Cambria Math"/>
-              </w:rPr>
-              <m:t>ⅆt</m:t>
+                <w:sz w:val="32"/>
+                <w:szCs w:val="32"/>
+                <w:lang w:val="en-US"/>
+              </w:rPr>
+              <m:t>ⅆ</m:t>
+            </m:r>
+            <m:r>
+              <w:rPr>
+                <w:rFonts w:ascii="Cambria Math" w:hAnsi="Cambria Math"/>
+                <w:sz w:val="32"/>
+                <w:szCs w:val="32"/>
+              </w:rPr>
+              <m:t>t</m:t>
             </m:r>
           </m:den>
         </m:f>
@@ -229,41 +1097,150 @@
       <w:r>
         <w:rPr>
           <w:rFonts w:eastAsiaTheme="minorEastAsia"/>
+          <w:sz w:val="32"/>
+          <w:szCs w:val="32"/>
+          <w:lang w:val="en-US"/>
         </w:rPr>
         <w:t xml:space="preserve">  </w:t>
       </w:r>
       <w:r>
-        <w:t xml:space="preserve">= </w:t>
-      </w:r>
-      <w:proofErr w:type="spellStart"/>
-      <w:r>
-        <w:t>aP</w:t>
-      </w:r>
-      <w:proofErr w:type="spellEnd"/>
-      <w:r>
-        <w:t xml:space="preserve"> proposée.</w:t>
-      </w:r>
-    </w:p>
-    <w:p>
-      <w:r>
-        <w:t>Donc la solution proposée est bien solution de</w:t>
-      </w:r>
-      <w:r>
-        <w:t xml:space="preserve"> l’équation.</w:t>
-      </w:r>
-    </w:p>
-    <w:p/>
-    <w:p>
-      <w:r>
-        <w:t>(2) Déterminez la constante K de la solution donnée.</w:t>
-      </w:r>
-    </w:p>
-    <w:p>
-      <w:r>
-        <w:t>Nous savons donc que P</w:t>
-      </w:r>
-      <w:r>
-        <w:t>(0) = 2.</w:t>
+        <w:rPr>
+          <w:sz w:val="32"/>
+          <w:szCs w:val="32"/>
+          <w:lang w:val="en-US"/>
+        </w:rPr>
+        <w:t>= 0</w:t>
+      </w:r>
+      <w:r>
+        <w:rPr>
+          <w:sz w:val="32"/>
+          <w:szCs w:val="32"/>
+          <w:lang w:val="en-US"/>
+        </w:rPr>
+        <w:t xml:space="preserve"> </w:t>
+      </w:r>
+      <w:r>
+        <w:rPr>
+          <w:sz w:val="32"/>
+          <w:szCs w:val="32"/>
+        </w:rPr>
+        <w:sym w:font="Wingdings" w:char="F0F3"/>
+      </w:r>
+      <w:r>
+        <w:rPr>
+          <w:sz w:val="32"/>
+          <w:szCs w:val="32"/>
+          <w:lang w:val="en-US"/>
+        </w:rPr>
+        <w:t xml:space="preserve"> </w:t>
+      </w:r>
+      <m:oMath>
+        <m:f>
+          <m:fPr>
+            <m:ctrlPr>
+              <w:rPr>
+                <w:rFonts w:ascii="Cambria Math" w:hAnsi="Cambria Math"/>
+                <w:i/>
+                <w:sz w:val="32"/>
+                <w:szCs w:val="32"/>
+              </w:rPr>
+            </m:ctrlPr>
+          </m:fPr>
+          <m:num>
+            <m:r>
+              <w:rPr>
+                <w:rFonts w:ascii="Cambria Math" w:hAnsi="Cambria Math"/>
+                <w:sz w:val="32"/>
+                <w:szCs w:val="32"/>
+                <w:lang w:val="en-US"/>
+              </w:rPr>
+              <m:t>ⅆ</m:t>
+            </m:r>
+            <m:r>
+              <w:rPr>
+                <w:rFonts w:ascii="Cambria Math" w:hAnsi="Cambria Math"/>
+                <w:sz w:val="32"/>
+                <w:szCs w:val="32"/>
+              </w:rPr>
+              <m:t>P</m:t>
+            </m:r>
+          </m:num>
+          <m:den>
+            <m:r>
+              <w:rPr>
+                <w:rFonts w:ascii="Cambria Math" w:hAnsi="Cambria Math"/>
+                <w:sz w:val="32"/>
+                <w:szCs w:val="32"/>
+                <w:lang w:val="en-US"/>
+              </w:rPr>
+              <m:t>ⅆ</m:t>
+            </m:r>
+            <m:r>
+              <w:rPr>
+                <w:rFonts w:ascii="Cambria Math" w:hAnsi="Cambria Math"/>
+                <w:sz w:val="32"/>
+                <w:szCs w:val="32"/>
+              </w:rPr>
+              <m:t>t</m:t>
+            </m:r>
+          </m:den>
+        </m:f>
+      </m:oMath>
+      <w:r>
+        <w:rPr>
+          <w:rFonts w:eastAsiaTheme="minorEastAsia"/>
+          <w:sz w:val="32"/>
+          <w:szCs w:val="32"/>
+          <w:lang w:val="en-US"/>
+        </w:rPr>
+        <w:t xml:space="preserve">  </w:t>
+      </w:r>
+      <w:r>
+        <w:rPr>
+          <w:sz w:val="32"/>
+          <w:szCs w:val="32"/>
+          <w:lang w:val="en-US"/>
+        </w:rPr>
+        <w:t>= aP</w:t>
+      </w:r>
+      <w:r>
+        <w:rPr>
+          <w:sz w:val="32"/>
+          <w:szCs w:val="32"/>
+          <w:lang w:val="en-US"/>
+        </w:rPr>
+        <w:t xml:space="preserve"> </w:t>
+      </w:r>
+      <w:r>
+        <w:rPr>
+          <w:sz w:val="32"/>
+          <w:szCs w:val="32"/>
+        </w:rPr>
+        <w:sym w:font="Wingdings" w:char="F0F3"/>
+      </w:r>
+      <w:r>
+        <w:rPr>
+          <w:sz w:val="32"/>
+          <w:szCs w:val="32"/>
+          <w:lang w:val="en-US"/>
+        </w:rPr>
+        <w:t xml:space="preserve"> a</w:t>
+      </w:r>
+      <w:r>
+        <w:rPr>
+          <w:sz w:val="32"/>
+          <w:szCs w:val="32"/>
+          <w:lang w:val="en-US"/>
+        </w:rPr>
+        <w:t xml:space="preserve">P = </w:t>
+      </w:r>
+      <w:r>
+        <w:rPr>
+          <w:sz w:val="32"/>
+          <w:szCs w:val="32"/>
+          <w:lang w:val="en-US"/>
+        </w:rPr>
+        <w:t>0</w:t>
       </w:r>
     </w:p>
     <w:p>
@@ -272,169 +1249,13 @@
           <w:lang w:val="en-US"/>
         </w:rPr>
       </w:pPr>
-      <w:r>
-        <w:rPr>
-          <w:lang w:val="en-US"/>
-        </w:rPr>
-        <w:t xml:space="preserve">P(0) = K </w:t>
-      </w:r>
-      <w:r>
-        <w:rPr>
-          <w:lang w:val="en-US"/>
-        </w:rPr>
-        <w:t>×</w:t>
-      </w:r>
-      <w:r>
-        <w:rPr>
-          <w:lang w:val="en-US"/>
-        </w:rPr>
-        <w:t xml:space="preserve"> e </w:t>
-      </w:r>
-      <w:r>
-        <w:rPr>
-          <w:vertAlign w:val="superscript"/>
-          <w:lang w:val="en-US"/>
-        </w:rPr>
-        <w:t xml:space="preserve">a </w:t>
-      </w:r>
-      <w:r>
-        <w:rPr>
-          <w:vertAlign w:val="superscript"/>
-          <w:lang w:val="en-US"/>
-        </w:rPr>
-        <w:t>×</w:t>
-      </w:r>
-      <w:r>
-        <w:rPr>
-          <w:vertAlign w:val="superscript"/>
-          <w:lang w:val="en-US"/>
-        </w:rPr>
-        <w:t xml:space="preserve"> 0</w:t>
-      </w:r>
-      <w:r>
-        <w:rPr>
-          <w:vertAlign w:val="superscript"/>
-          <w:lang w:val="en-US"/>
-        </w:rPr>
-        <w:t xml:space="preserve"> </w:t>
-      </w:r>
-      <w:r>
-        <w:rPr>
-          <w:lang w:val="en-US"/>
-        </w:rPr>
-        <w:sym w:font="Wingdings" w:char="F0F3"/>
-      </w:r>
-      <w:r>
-        <w:rPr>
-          <w:lang w:val="en-US"/>
-        </w:rPr>
-        <w:t xml:space="preserve"> P(0) = K </w:t>
-      </w:r>
-      <w:r>
-        <w:rPr>
-          <w:lang w:val="en-US"/>
-        </w:rPr>
-        <w:t>×</w:t>
-      </w:r>
-      <w:r>
-        <w:rPr>
-          <w:lang w:val="en-US"/>
-        </w:rPr>
-        <w:t xml:space="preserve"> e </w:t>
-      </w:r>
-      <w:r>
-        <w:rPr>
-          <w:vertAlign w:val="superscript"/>
-          <w:lang w:val="en-US"/>
-        </w:rPr>
-        <w:t>0</w:t>
-      </w:r>
-      <w:r>
-        <w:rPr>
-          <w:lang w:val="en-US"/>
-        </w:rPr>
-        <w:t xml:space="preserve"> </w:t>
-      </w:r>
-      <w:r>
-        <w:rPr>
-          <w:lang w:val="en-US"/>
-        </w:rPr>
-        <w:sym w:font="Wingdings" w:char="F0F3"/>
-      </w:r>
-      <w:r>
-        <w:rPr>
-          <w:lang w:val="en-US"/>
-        </w:rPr>
-        <w:t xml:space="preserve"> P(0) = K </w:t>
-      </w:r>
-      <w:r>
-        <w:rPr>
-          <w:lang w:val="en-US"/>
-        </w:rPr>
-        <w:t>×</w:t>
-      </w:r>
-      <w:r>
-        <w:rPr>
-          <w:lang w:val="en-US"/>
-        </w:rPr>
-        <w:t xml:space="preserve"> 1 </w:t>
-      </w:r>
-      <w:r>
-        <w:rPr>
-          <w:lang w:val="en-US"/>
-        </w:rPr>
-        <w:sym w:font="Wingdings" w:char="F0F3"/>
-      </w:r>
-      <w:r>
-        <w:rPr>
-          <w:lang w:val="en-US"/>
-        </w:rPr>
-        <w:t xml:space="preserve"> P(0) = K</w:t>
-      </w:r>
-      <w:r>
-        <w:rPr>
-          <w:lang w:val="en-US"/>
-        </w:rPr>
-        <w:t xml:space="preserve"> </w:t>
-      </w:r>
-      <w:r>
-        <w:rPr>
-          <w:lang w:val="en-US"/>
-        </w:rPr>
-        <w:sym w:font="Wingdings" w:char="F0F3"/>
-      </w:r>
-      <w:r>
-        <w:rPr>
-          <w:lang w:val="en-US"/>
-        </w:rPr>
-        <w:t xml:space="preserve"> K = 2.</w:t>
-      </w:r>
-    </w:p>
-    <w:p>
-      <w:r>
-        <w:t>Dans notre cas, on a d</w:t>
-      </w:r>
-      <w:r>
-        <w:t>onc K = 2.</w:t>
-      </w:r>
-    </w:p>
-    <w:p/>
-    <w:p>
-      <w:r>
-        <w:t>(3) Tracez la solution dans un tableur pour une population initiale de 2 lapins et un taux de reproduction a = 0, 05. On choisira comme unité temporelle le jour (à t = 5, nous sommes au cinquième jour).</w:t>
-      </w:r>
-    </w:p>
-    <w:p>
-      <w:r>
-        <w:t>Voir solution Excel</w:t>
-      </w:r>
-    </w:p>
-    <w:p/>
-    <w:p>
-      <w:r>
-        <w:lastRenderedPageBreak/>
-        <w:t>(4) Vers quelle valeur tend la population de lapins lorsque le temps devient grand ? Montrez-le à l’aide du graphique. Éventuellement, démontrez-le avec l’expression donnée plus haut.</w:t>
-      </w:r>
+    </w:p>
+    <w:p>
+      <w:pPr>
+        <w:rPr>
+          <w:lang w:val="en-US"/>
+        </w:rPr>
+      </w:pPr>
     </w:p>
     <w:sectPr>
       <w:pgSz w:w="11906" w:h="16838"/>

</xml_diff>

<commit_message>
Avancement des exercices de la partie 1.
</commit_message>
<xml_diff>
--- a/Maths/Moteur_RTS_exercices_maths.docx
+++ b/Maths/Moteur_RTS_exercices_maths.docx
@@ -78,6 +78,9 @@
       </w:r>
     </w:p>
     <w:p>
+      <w:pPr>
+        <w:shd w:val="clear" w:color="auto" w:fill="0F9ED5" w:themeFill="accent4"/>
+      </w:pPr>
       <w:r>
         <w:t xml:space="preserve">La solution de l’équation est de la forme </w:t>
       </w:r>
@@ -502,6 +505,9 @@
       </w:pPr>
     </w:p>
     <w:p>
+      <w:pPr>
+        <w:shd w:val="clear" w:color="auto" w:fill="0F9ED5" w:themeFill="accent4"/>
+      </w:pPr>
       <w:r>
         <w:t xml:space="preserve">Ajout </w:t>
       </w:r>
@@ -511,6 +517,7 @@
     </w:p>
     <w:p>
       <w:pPr>
+        <w:shd w:val="clear" w:color="auto" w:fill="0F9ED5" w:themeFill="accent4"/>
         <w:jc w:val="center"/>
         <w:rPr>
           <w:sz w:val="32"/>
@@ -564,18 +571,12 @@
           <w:sz w:val="32"/>
           <w:szCs w:val="32"/>
         </w:rPr>
-        <w:t>= aP</w:t>
-      </w:r>
-      <w:r>
-        <w:rPr>
-          <w:sz w:val="32"/>
-          <w:szCs w:val="32"/>
-        </w:rPr>
-        <w:t xml:space="preserve"> – bP²</w:t>
-      </w:r>
-    </w:p>
-    <w:p>
-      <w:pPr>
+        <w:t>= aP – bP²</w:t>
+      </w:r>
+    </w:p>
+    <w:p>
+      <w:pPr>
+        <w:shd w:val="clear" w:color="auto" w:fill="0F9ED5" w:themeFill="accent4"/>
         <w:rPr>
           <w:rFonts w:eastAsiaTheme="minorEastAsia"/>
           <w:sz w:val="32"/>
@@ -644,15 +645,7 @@
                     <w:sz w:val="32"/>
                     <w:szCs w:val="32"/>
                   </w:rPr>
-                  <m:t>K</m:t>
-                </m:r>
-                <m:r>
-                  <w:rPr>
-                    <w:rFonts w:ascii="Cambria Math" w:hAnsi="Cambria Math"/>
-                    <w:sz w:val="32"/>
-                    <w:szCs w:val="32"/>
-                  </w:rPr>
-                  <m:t>-P0</m:t>
+                  <m:t>K-P0</m:t>
                 </m:r>
               </m:num>
               <m:den>
@@ -672,7 +665,6 @@
               </m:rPr>
               <w:rPr>
                 <w:rFonts w:ascii="Cambria Math" w:hAnsi="Cambria Math"/>
-                <w:lang w:val="en-US"/>
               </w:rPr>
               <m:t>×</m:t>
             </m:r>
@@ -895,6 +887,9 @@
       </w:pPr>
     </w:p>
     <w:p>
+      <w:pPr>
+        <w:shd w:val="clear" w:color="auto" w:fill="0F9ED5" w:themeFill="accent4"/>
+      </w:pPr>
       <w:r>
         <w:t>On dit que la population a atteint un équilibre statique lorsqu’elle ne varie plus dans le temps. Autrement dit, la variation de la population P est nulle :</w:t>
       </w:r>
@@ -975,7 +970,19 @@
     <w:p/>
     <w:p>
       <w:r>
-        <w:t xml:space="preserve">On cherche donc une valeur pour que </w:t>
+        <w:t xml:space="preserve">On cherche donc </w:t>
+      </w:r>
+      <w:r>
+        <w:t>les</w:t>
+      </w:r>
+      <w:r>
+        <w:t xml:space="preserve"> valeur</w:t>
+      </w:r>
+      <w:r>
+        <w:t>s</w:t>
+      </w:r>
+      <w:r>
+        <w:t xml:space="preserve"> pour que </w:t>
       </w:r>
       <m:oMath>
         <m:f>
@@ -984,8 +991,6 @@
               <w:rPr>
                 <w:rFonts w:ascii="Cambria Math" w:hAnsi="Cambria Math"/>
                 <w:i/>
-                <w:sz w:val="32"/>
-                <w:szCs w:val="32"/>
               </w:rPr>
             </m:ctrlPr>
           </m:fPr>
@@ -993,8 +998,6 @@
             <m:r>
               <w:rPr>
                 <w:rFonts w:ascii="Cambria Math" w:hAnsi="Cambria Math"/>
-                <w:sz w:val="32"/>
-                <w:szCs w:val="32"/>
               </w:rPr>
               <m:t>ⅆP</m:t>
             </m:r>
@@ -1003,8 +1006,6 @@
             <m:r>
               <w:rPr>
                 <w:rFonts w:ascii="Cambria Math" w:hAnsi="Cambria Math"/>
-                <w:sz w:val="32"/>
-                <w:szCs w:val="32"/>
               </w:rPr>
               <m:t>ⅆt</m:t>
             </m:r>
@@ -1014,34 +1015,14 @@
       <w:r>
         <w:rPr>
           <w:rFonts w:eastAsiaTheme="minorEastAsia"/>
-          <w:sz w:val="32"/>
-          <w:szCs w:val="32"/>
         </w:rPr>
         <w:t xml:space="preserve">  </w:t>
       </w:r>
       <w:r>
-        <w:rPr>
-          <w:sz w:val="32"/>
-          <w:szCs w:val="32"/>
-        </w:rPr>
-        <w:t>=</w:t>
-      </w:r>
-      <w:r>
-        <w:rPr>
-          <w:sz w:val="32"/>
-          <w:szCs w:val="32"/>
-        </w:rPr>
-        <w:t xml:space="preserve"> 0</w:t>
-      </w:r>
-    </w:p>
-    <w:p>
-      <w:pPr>
-        <w:rPr>
-          <w:sz w:val="32"/>
-          <w:szCs w:val="32"/>
-          <w:lang w:val="en-US"/>
-        </w:rPr>
-      </w:pPr>
+        <w:t>= 0</w:t>
+      </w:r>
+    </w:p>
+    <w:p>
       <m:oMath>
         <m:f>
           <m:fPr>
@@ -1049,8 +1030,6 @@
               <w:rPr>
                 <w:rFonts w:ascii="Cambria Math" w:hAnsi="Cambria Math"/>
                 <w:i/>
-                <w:sz w:val="32"/>
-                <w:szCs w:val="32"/>
               </w:rPr>
             </m:ctrlPr>
           </m:fPr>
@@ -1058,38 +1037,16 @@
             <m:r>
               <w:rPr>
                 <w:rFonts w:ascii="Cambria Math" w:hAnsi="Cambria Math"/>
-                <w:sz w:val="32"/>
-                <w:szCs w:val="32"/>
-                <w:lang w:val="en-US"/>
-              </w:rPr>
-              <m:t>ⅆ</m:t>
-            </m:r>
-            <m:r>
-              <w:rPr>
-                <w:rFonts w:ascii="Cambria Math" w:hAnsi="Cambria Math"/>
-                <w:sz w:val="32"/>
-                <w:szCs w:val="32"/>
-              </w:rPr>
-              <m:t>P</m:t>
+              </w:rPr>
+              <m:t>ⅆP</m:t>
             </m:r>
           </m:num>
           <m:den>
             <m:r>
               <w:rPr>
                 <w:rFonts w:ascii="Cambria Math" w:hAnsi="Cambria Math"/>
-                <w:sz w:val="32"/>
-                <w:szCs w:val="32"/>
-                <w:lang w:val="en-US"/>
-              </w:rPr>
-              <m:t>ⅆ</m:t>
-            </m:r>
-            <m:r>
-              <w:rPr>
-                <w:rFonts w:ascii="Cambria Math" w:hAnsi="Cambria Math"/>
-                <w:sz w:val="32"/>
-                <w:szCs w:val="32"/>
-              </w:rPr>
-              <m:t>t</m:t>
+              </w:rPr>
+              <m:t>ⅆt</m:t>
             </m:r>
           </m:den>
         </m:f>
@@ -1097,42 +1054,14 @@
       <w:r>
         <w:rPr>
           <w:rFonts w:eastAsiaTheme="minorEastAsia"/>
-          <w:sz w:val="32"/>
-          <w:szCs w:val="32"/>
-          <w:lang w:val="en-US"/>
         </w:rPr>
         <w:t xml:space="preserve">  </w:t>
       </w:r>
       <w:r>
-        <w:rPr>
-          <w:sz w:val="32"/>
-          <w:szCs w:val="32"/>
-          <w:lang w:val="en-US"/>
-        </w:rPr>
-        <w:t>= 0</w:t>
-      </w:r>
-      <w:r>
-        <w:rPr>
-          <w:sz w:val="32"/>
-          <w:szCs w:val="32"/>
-          <w:lang w:val="en-US"/>
-        </w:rPr>
-        <w:t xml:space="preserve"> </w:t>
-      </w:r>
-      <w:r>
-        <w:rPr>
-          <w:sz w:val="32"/>
-          <w:szCs w:val="32"/>
-        </w:rPr>
-        <w:sym w:font="Wingdings" w:char="F0F3"/>
-      </w:r>
-      <w:r>
-        <w:rPr>
-          <w:sz w:val="32"/>
-          <w:szCs w:val="32"/>
-          <w:lang w:val="en-US"/>
-        </w:rPr>
-        <w:t xml:space="preserve"> </w:t>
+        <w:t xml:space="preserve">= aP </w:t>
+      </w:r>
+      <w:r>
+        <w:t xml:space="preserve">, donc </w:t>
       </w:r>
       <m:oMath>
         <m:f>
@@ -1141,8 +1070,6 @@
               <w:rPr>
                 <w:rFonts w:ascii="Cambria Math" w:hAnsi="Cambria Math"/>
                 <w:i/>
-                <w:sz w:val="32"/>
-                <w:szCs w:val="32"/>
               </w:rPr>
             </m:ctrlPr>
           </m:fPr>
@@ -1150,38 +1077,16 @@
             <m:r>
               <w:rPr>
                 <w:rFonts w:ascii="Cambria Math" w:hAnsi="Cambria Math"/>
-                <w:sz w:val="32"/>
-                <w:szCs w:val="32"/>
-                <w:lang w:val="en-US"/>
-              </w:rPr>
-              <m:t>ⅆ</m:t>
-            </m:r>
-            <m:r>
-              <w:rPr>
-                <w:rFonts w:ascii="Cambria Math" w:hAnsi="Cambria Math"/>
-                <w:sz w:val="32"/>
-                <w:szCs w:val="32"/>
-              </w:rPr>
-              <m:t>P</m:t>
+              </w:rPr>
+              <m:t>ⅆP</m:t>
             </m:r>
           </m:num>
           <m:den>
             <m:r>
               <w:rPr>
                 <w:rFonts w:ascii="Cambria Math" w:hAnsi="Cambria Math"/>
-                <w:sz w:val="32"/>
-                <w:szCs w:val="32"/>
-                <w:lang w:val="en-US"/>
-              </w:rPr>
-              <m:t>ⅆ</m:t>
-            </m:r>
-            <m:r>
-              <w:rPr>
-                <w:rFonts w:ascii="Cambria Math" w:hAnsi="Cambria Math"/>
-                <w:sz w:val="32"/>
-                <w:szCs w:val="32"/>
-              </w:rPr>
-              <m:t>t</m:t>
+              </w:rPr>
+              <m:t>ⅆt</m:t>
             </m:r>
           </m:den>
         </m:f>
@@ -1189,74 +1094,1643 @@
       <w:r>
         <w:rPr>
           <w:rFonts w:eastAsiaTheme="minorEastAsia"/>
-          <w:sz w:val="32"/>
-          <w:szCs w:val="32"/>
+        </w:rPr>
+        <w:t xml:space="preserve">  </w:t>
+      </w:r>
+      <w:r>
+        <w:t xml:space="preserve">= 0 </w:t>
+      </w:r>
+      <w:r>
+        <w:sym w:font="Wingdings" w:char="F0F3"/>
+      </w:r>
+      <w:r>
+        <w:t xml:space="preserve"> aP = </w:t>
+      </w:r>
+      <w:r>
+        <w:t>0</w:t>
+      </w:r>
+      <w:r>
+        <w:t xml:space="preserve"> </w:t>
+      </w:r>
+      <w:r>
+        <w:rPr>
           <w:lang w:val="en-US"/>
         </w:rPr>
+        <w:sym w:font="Wingdings" w:char="F0F3"/>
+      </w:r>
+      <w:r>
+        <w:t xml:space="preserve"> a = 0 ou P = 0</w:t>
+      </w:r>
+    </w:p>
+    <w:p>
+      <w:r>
+        <w:lastRenderedPageBreak/>
+        <w:t>Le premier modèle a donc un état d’équilibre statique, pour P = 0.</w:t>
+      </w:r>
+      <w:r>
+        <w:t xml:space="preserve"> C’est-à-dire que l’équilibre est atteint uniquement lorsqu’il n’y a plus de population.</w:t>
+      </w:r>
+    </w:p>
+    <w:p>
+      <w:pPr>
+        <w:rPr>
+          <w:sz w:val="32"/>
+          <w:szCs w:val="32"/>
+        </w:rPr>
+      </w:pPr>
+    </w:p>
+    <w:p>
+      <w:r>
+        <w:t>(2) En reprenant le second modèle, quels sont ses états d’équilibre statiques ?</w:t>
+      </w:r>
+    </w:p>
+    <w:p/>
+    <w:p>
+      <w:pPr>
+        <w:rPr>
+          <w:sz w:val="32"/>
+          <w:szCs w:val="32"/>
+        </w:rPr>
+      </w:pPr>
+      <w:r>
+        <w:t xml:space="preserve">On cherche les valeurs pour que </w:t>
+      </w:r>
+      <m:oMath>
+        <m:f>
+          <m:fPr>
+            <m:ctrlPr>
+              <w:rPr>
+                <w:rFonts w:ascii="Cambria Math" w:hAnsi="Cambria Math"/>
+                <w:i/>
+                <w:sz w:val="32"/>
+                <w:szCs w:val="32"/>
+              </w:rPr>
+            </m:ctrlPr>
+          </m:fPr>
+          <m:num>
+            <m:r>
+              <w:rPr>
+                <w:rFonts w:ascii="Cambria Math" w:hAnsi="Cambria Math"/>
+                <w:sz w:val="32"/>
+                <w:szCs w:val="32"/>
+              </w:rPr>
+              <m:t>ⅆP</m:t>
+            </m:r>
+          </m:num>
+          <m:den>
+            <m:r>
+              <w:rPr>
+                <w:rFonts w:ascii="Cambria Math" w:hAnsi="Cambria Math"/>
+                <w:sz w:val="32"/>
+                <w:szCs w:val="32"/>
+              </w:rPr>
+              <m:t>ⅆt</m:t>
+            </m:r>
+          </m:den>
+        </m:f>
+      </m:oMath>
+      <w:r>
+        <w:rPr>
+          <w:rFonts w:eastAsiaTheme="minorEastAsia"/>
+          <w:sz w:val="32"/>
+          <w:szCs w:val="32"/>
+        </w:rPr>
         <w:t xml:space="preserve">  </w:t>
       </w:r>
       <w:r>
         <w:rPr>
           <w:sz w:val="32"/>
           <w:szCs w:val="32"/>
+        </w:rPr>
+        <w:t>=</w:t>
+      </w:r>
+      <w:r>
+        <w:rPr>
+          <w:sz w:val="32"/>
+          <w:szCs w:val="32"/>
+        </w:rPr>
+        <w:t xml:space="preserve"> 0</w:t>
+      </w:r>
+      <w:r>
+        <w:rPr>
+          <w:sz w:val="32"/>
+          <w:szCs w:val="32"/>
+        </w:rPr>
+        <w:t>.</w:t>
+      </w:r>
+    </w:p>
+    <w:p>
+      <w:pPr>
+        <w:rPr>
           <w:lang w:val="en-US"/>
         </w:rPr>
+      </w:pPr>
+      <m:oMath>
+        <m:f>
+          <m:fPr>
+            <m:ctrlPr>
+              <w:rPr>
+                <w:rFonts w:ascii="Cambria Math" w:hAnsi="Cambria Math"/>
+                <w:i/>
+                <w:sz w:val="32"/>
+                <w:szCs w:val="32"/>
+              </w:rPr>
+            </m:ctrlPr>
+          </m:fPr>
+          <m:num>
+            <m:r>
+              <w:rPr>
+                <w:rFonts w:ascii="Cambria Math" w:hAnsi="Cambria Math"/>
+                <w:sz w:val="32"/>
+                <w:szCs w:val="32"/>
+                <w:lang w:val="en-US"/>
+              </w:rPr>
+              <m:t>ⅆ</m:t>
+            </m:r>
+            <m:r>
+              <w:rPr>
+                <w:rFonts w:ascii="Cambria Math" w:hAnsi="Cambria Math"/>
+                <w:sz w:val="32"/>
+                <w:szCs w:val="32"/>
+              </w:rPr>
+              <m:t>P</m:t>
+            </m:r>
+          </m:num>
+          <m:den>
+            <m:r>
+              <w:rPr>
+                <w:rFonts w:ascii="Cambria Math" w:hAnsi="Cambria Math"/>
+                <w:sz w:val="32"/>
+                <w:szCs w:val="32"/>
+                <w:lang w:val="en-US"/>
+              </w:rPr>
+              <m:t>ⅆ</m:t>
+            </m:r>
+            <m:r>
+              <w:rPr>
+                <w:rFonts w:ascii="Cambria Math" w:hAnsi="Cambria Math"/>
+                <w:sz w:val="32"/>
+                <w:szCs w:val="32"/>
+              </w:rPr>
+              <m:t>t</m:t>
+            </m:r>
+          </m:den>
+        </m:f>
+      </m:oMath>
+      <w:r>
+        <w:rPr>
+          <w:rFonts w:eastAsiaTheme="minorEastAsia"/>
+          <w:sz w:val="32"/>
+          <w:szCs w:val="32"/>
+          <w:lang w:val="en-US"/>
+        </w:rPr>
+        <w:t xml:space="preserve">  </w:t>
+      </w:r>
+      <w:r>
+        <w:rPr>
+          <w:lang w:val="en-US"/>
+        </w:rPr>
         <w:t>= aP</w:t>
       </w:r>
       <w:r>
         <w:rPr>
-          <w:sz w:val="32"/>
-          <w:szCs w:val="32"/>
           <w:lang w:val="en-US"/>
         </w:rPr>
+        <w:t xml:space="preserve"> – bP²</w:t>
+      </w:r>
+      <w:r>
+        <w:rPr>
+          <w:lang w:val="en-US"/>
+        </w:rPr>
+        <w:t xml:space="preserve"> , donc </w:t>
+      </w:r>
+      <m:oMath>
+        <m:f>
+          <m:fPr>
+            <m:ctrlPr>
+              <w:rPr>
+                <w:rFonts w:ascii="Cambria Math" w:hAnsi="Cambria Math"/>
+                <w:i/>
+              </w:rPr>
+            </m:ctrlPr>
+          </m:fPr>
+          <m:num>
+            <m:r>
+              <w:rPr>
+                <w:rFonts w:ascii="Cambria Math" w:hAnsi="Cambria Math"/>
+                <w:lang w:val="en-US"/>
+              </w:rPr>
+              <m:t>ⅆ</m:t>
+            </m:r>
+            <m:r>
+              <w:rPr>
+                <w:rFonts w:ascii="Cambria Math" w:hAnsi="Cambria Math"/>
+              </w:rPr>
+              <m:t>P</m:t>
+            </m:r>
+          </m:num>
+          <m:den>
+            <m:r>
+              <w:rPr>
+                <w:rFonts w:ascii="Cambria Math" w:hAnsi="Cambria Math"/>
+                <w:lang w:val="en-US"/>
+              </w:rPr>
+              <m:t>ⅆ</m:t>
+            </m:r>
+            <m:r>
+              <w:rPr>
+                <w:rFonts w:ascii="Cambria Math" w:hAnsi="Cambria Math"/>
+              </w:rPr>
+              <m:t>t</m:t>
+            </m:r>
+          </m:den>
+        </m:f>
+      </m:oMath>
+      <w:r>
+        <w:rPr>
+          <w:rFonts w:eastAsiaTheme="minorEastAsia"/>
+          <w:lang w:val="en-US"/>
+        </w:rPr>
+        <w:t xml:space="preserve">  </w:t>
+      </w:r>
+      <w:r>
+        <w:rPr>
+          <w:lang w:val="en-US"/>
+        </w:rPr>
+        <w:t xml:space="preserve">= 0 </w:t>
+      </w:r>
+      <w:r>
+        <w:sym w:font="Wingdings" w:char="F0F3"/>
+      </w:r>
+      <w:r>
+        <w:rPr>
+          <w:lang w:val="en-US"/>
+        </w:rPr>
+        <w:t xml:space="preserve"> aP – bP² = 0</w:t>
+      </w:r>
+      <w:r>
+        <w:rPr>
+          <w:lang w:val="en-US"/>
+        </w:rPr>
         <w:t xml:space="preserve"> </w:t>
       </w:r>
       <w:r>
-        <w:rPr>
-          <w:sz w:val="32"/>
-          <w:szCs w:val="32"/>
-        </w:rPr>
         <w:sym w:font="Wingdings" w:char="F0F3"/>
       </w:r>
       <w:r>
         <w:rPr>
-          <w:sz w:val="32"/>
-          <w:szCs w:val="32"/>
           <w:lang w:val="en-US"/>
         </w:rPr>
-        <w:t xml:space="preserve"> a</w:t>
-      </w:r>
-      <w:r>
-        <w:rPr>
-          <w:sz w:val="32"/>
-          <w:szCs w:val="32"/>
+        <w:t xml:space="preserve"> P(a – bP) = 0</w:t>
+      </w:r>
+    </w:p>
+    <w:p>
+      <w:r>
+        <w:rPr>
+          <w:rFonts w:eastAsiaTheme="minorEastAsia"/>
+        </w:rPr>
+        <w:t xml:space="preserve">Donc </w:t>
+      </w:r>
+      <w:r>
+        <w:t>P(a – bP) = 0</w:t>
+      </w:r>
+      <w:r>
+        <w:t xml:space="preserve"> si :</w:t>
+      </w:r>
+    </w:p>
+    <w:p>
+      <w:pPr>
+        <w:pStyle w:val="Paragraphedeliste"/>
+        <w:numPr>
+          <w:ilvl w:val="0"/>
+          <w:numId w:val="1"/>
+        </w:numPr>
+      </w:pPr>
+      <w:r>
+        <w:t>P = 0</w:t>
+      </w:r>
+    </w:p>
+    <w:p>
+      <w:pPr>
+        <w:pStyle w:val="Paragraphedeliste"/>
+        <w:numPr>
+          <w:ilvl w:val="0"/>
+          <w:numId w:val="1"/>
+        </w:numPr>
+      </w:pPr>
+      <w:r>
+        <w:t>a – bP = 0</w:t>
+      </w:r>
+    </w:p>
+    <w:p>
+      <w:pPr>
+        <w:rPr>
+          <w:rFonts w:eastAsiaTheme="minorEastAsia"/>
+          <w:sz w:val="32"/>
+          <w:szCs w:val="32"/>
+        </w:rPr>
+      </w:pPr>
+      <w:r>
+        <w:rPr>
           <w:lang w:val="en-US"/>
         </w:rPr>
-        <w:t xml:space="preserve">P = </w:t>
-      </w:r>
-      <w:r>
-        <w:rPr>
-          <w:sz w:val="32"/>
-          <w:szCs w:val="32"/>
+        <w:t xml:space="preserve">a – bP = 0 </w:t>
+      </w:r>
+      <w:r>
+        <w:sym w:font="Wingdings" w:char="F0F3"/>
+      </w:r>
+      <w:r>
+        <w:rPr>
           <w:lang w:val="en-US"/>
         </w:rPr>
-        <w:t>0</w:t>
-      </w:r>
-    </w:p>
-    <w:p>
-      <w:pPr>
+        <w:t xml:space="preserve"> - bP = -a </w:t>
+      </w:r>
+      <w:r>
+        <w:sym w:font="Wingdings" w:char="F0F3"/>
+      </w:r>
+      <w:r>
         <w:rPr>
           <w:lang w:val="en-US"/>
         </w:rPr>
-      </w:pPr>
-    </w:p>
-    <w:p>
-      <w:pPr>
+        <w:t xml:space="preserve"> bP = a </w:t>
+      </w:r>
+      <w:r>
+        <w:sym w:font="Wingdings" w:char="F0F3"/>
+      </w:r>
+      <w:r>
         <w:rPr>
           <w:lang w:val="en-US"/>
         </w:rPr>
-      </w:pPr>
-    </w:p>
+        <w:t xml:space="preserve"> P </w:t>
+      </w:r>
+      <w:r>
+        <w:rPr>
+          <w:lang w:val="en-US"/>
+        </w:rPr>
+        <w:t xml:space="preserve">= </w:t>
+      </w:r>
+      <m:oMath>
+        <m:f>
+          <m:fPr>
+            <m:ctrlPr>
+              <w:rPr>
+                <w:rFonts w:ascii="Cambria Math" w:hAnsi="Cambria Math"/>
+                <w:i/>
+                <w:sz w:val="32"/>
+                <w:szCs w:val="32"/>
+              </w:rPr>
+            </m:ctrlPr>
+          </m:fPr>
+          <m:num>
+            <m:r>
+              <w:rPr>
+                <w:rFonts w:ascii="Cambria Math" w:hAnsi="Cambria Math"/>
+                <w:sz w:val="32"/>
+                <w:szCs w:val="32"/>
+                <w:lang w:val="en-US"/>
+              </w:rPr>
+              <m:t>a</m:t>
+            </m:r>
+          </m:num>
+          <m:den>
+            <m:r>
+              <w:rPr>
+                <w:rFonts w:ascii="Cambria Math" w:hAnsi="Cambria Math"/>
+                <w:sz w:val="32"/>
+                <w:szCs w:val="32"/>
+                <w:lang w:val="en-US"/>
+              </w:rPr>
+              <m:t>b</m:t>
+            </m:r>
+          </m:den>
+        </m:f>
+      </m:oMath>
+    </w:p>
+    <w:p>
+      <w:pPr>
+        <w:rPr>
+          <w:rFonts w:eastAsiaTheme="minorEastAsia"/>
+          <w:sz w:val="32"/>
+          <w:szCs w:val="32"/>
+        </w:rPr>
+      </w:pPr>
+      <w:r>
+        <w:rPr>
+          <w:rFonts w:eastAsiaTheme="minorEastAsia"/>
+        </w:rPr>
+        <w:t>Donc</w:t>
+      </w:r>
+      <w:r>
+        <w:rPr>
+          <w:rFonts w:eastAsiaTheme="minorEastAsia"/>
+        </w:rPr>
+        <w:t xml:space="preserve">, les états d’équilibre statiques du modèles sont </w:t>
+      </w:r>
+      <w:r>
+        <w:rPr>
+          <w:rFonts w:eastAsiaTheme="minorEastAsia"/>
+        </w:rPr>
+        <w:t xml:space="preserve">pour P = 0 et P = </w:t>
+      </w:r>
+      <m:oMath>
+        <m:f>
+          <m:fPr>
+            <m:ctrlPr>
+              <w:rPr>
+                <w:rFonts w:ascii="Cambria Math" w:hAnsi="Cambria Math"/>
+                <w:i/>
+                <w:sz w:val="32"/>
+                <w:szCs w:val="32"/>
+              </w:rPr>
+            </m:ctrlPr>
+          </m:fPr>
+          <m:num>
+            <m:r>
+              <w:rPr>
+                <w:rFonts w:ascii="Cambria Math" w:hAnsi="Cambria Math"/>
+                <w:sz w:val="32"/>
+                <w:szCs w:val="32"/>
+                <w:lang w:val="en-US"/>
+              </w:rPr>
+              <m:t>a</m:t>
+            </m:r>
+          </m:num>
+          <m:den>
+            <m:r>
+              <w:rPr>
+                <w:rFonts w:ascii="Cambria Math" w:hAnsi="Cambria Math"/>
+                <w:sz w:val="32"/>
+                <w:szCs w:val="32"/>
+                <w:lang w:val="en-US"/>
+              </w:rPr>
+              <m:t>b</m:t>
+            </m:r>
+          </m:den>
+        </m:f>
+      </m:oMath>
+      <w:r>
+        <w:rPr>
+          <w:rFonts w:eastAsiaTheme="minorEastAsia"/>
+          <w:sz w:val="32"/>
+          <w:szCs w:val="32"/>
+        </w:rPr>
+        <w:t>.</w:t>
+      </w:r>
+    </w:p>
+    <w:p>
+      <w:pPr>
+        <w:rPr>
+          <w:rFonts w:eastAsiaTheme="minorEastAsia"/>
+        </w:rPr>
+      </w:pPr>
+      <w:r>
+        <w:rPr>
+          <w:rFonts w:eastAsiaTheme="minorEastAsia"/>
+        </w:rPr>
+        <w:t>C’est-à-dire que l’équilibre est atteint pour une population nulle, ou</w:t>
+      </w:r>
+      <w:r>
+        <w:rPr>
+          <w:rFonts w:eastAsiaTheme="minorEastAsia"/>
+        </w:rPr>
+        <w:t xml:space="preserve"> pour K.</w:t>
+      </w:r>
+    </w:p>
+    <w:p>
+      <w:pPr>
+        <w:rPr>
+          <w:rFonts w:eastAsiaTheme="minorEastAsia"/>
+          <w:sz w:val="32"/>
+          <w:szCs w:val="32"/>
+        </w:rPr>
+      </w:pPr>
+    </w:p>
+    <w:p>
+      <w:pPr>
+        <w:jc w:val="center"/>
+        <w:rPr>
+          <w:sz w:val="32"/>
+          <w:szCs w:val="32"/>
+          <w:u w:val="single"/>
+        </w:rPr>
+      </w:pPr>
+      <w:r>
+        <w:rPr>
+          <w:sz w:val="32"/>
+          <w:szCs w:val="32"/>
+          <w:u w:val="single"/>
+        </w:rPr>
+        <w:t xml:space="preserve">Systèmes dynamiques – </w:t>
+      </w:r>
+      <w:r>
+        <w:rPr>
+          <w:sz w:val="32"/>
+          <w:szCs w:val="32"/>
+          <w:u w:val="single"/>
+        </w:rPr>
+        <w:t>Modèle de Lotka-Volterra</w:t>
+      </w:r>
+    </w:p>
+    <w:p/>
+    <w:p>
+      <w:pPr>
+        <w:rPr>
+          <w:sz w:val="28"/>
+          <w:szCs w:val="28"/>
+          <w:u w:val="single"/>
+        </w:rPr>
+      </w:pPr>
+      <w:r>
+        <w:rPr>
+          <w:sz w:val="28"/>
+          <w:szCs w:val="28"/>
+          <w:u w:val="single"/>
+        </w:rPr>
+        <w:t>Modèle de Lotka-Volterra</w:t>
+      </w:r>
+      <w:r>
+        <w:rPr>
+          <w:sz w:val="28"/>
+          <w:szCs w:val="28"/>
+          <w:u w:val="single"/>
+        </w:rPr>
+        <w:t> :</w:t>
+      </w:r>
+    </w:p>
+    <w:p>
+      <w:pPr>
+        <w:shd w:val="clear" w:color="auto" w:fill="0F9ED5" w:themeFill="accent4"/>
+      </w:pPr>
+      <w:r>
+        <w:t xml:space="preserve">Le modèle fait intervenir 2 populations : </w:t>
+      </w:r>
+    </w:p>
+    <w:p>
+      <w:pPr>
+        <w:shd w:val="clear" w:color="auto" w:fill="0F9ED5" w:themeFill="accent4"/>
+        <w:spacing w:line="240" w:lineRule="auto"/>
+      </w:pPr>
+      <w:r>
+        <w:t xml:space="preserve">• La population H des proies (par exemple des herbivores). </w:t>
+      </w:r>
+    </w:p>
+    <w:p>
+      <w:pPr>
+        <w:shd w:val="clear" w:color="auto" w:fill="0F9ED5" w:themeFill="accent4"/>
+        <w:spacing w:line="240" w:lineRule="auto"/>
+      </w:pPr>
+      <w:r>
+        <w:t xml:space="preserve">• La population C des prédateurs (par exemple des carnivores). </w:t>
+      </w:r>
+    </w:p>
+    <w:p>
+      <w:pPr>
+        <w:shd w:val="clear" w:color="auto" w:fill="0F9ED5" w:themeFill="accent4"/>
+      </w:pPr>
+      <w:r>
+        <w:t xml:space="preserve">Le modèle suppose toujours que pour les proies, la nourriture est disponible à volonté. </w:t>
+      </w:r>
+    </w:p>
+    <w:p>
+      <w:pPr>
+        <w:shd w:val="clear" w:color="auto" w:fill="0F9ED5" w:themeFill="accent4"/>
+      </w:pPr>
+      <w:r>
+        <w:t xml:space="preserve">Le modèle s’écrit : </w:t>
+      </w:r>
+      <m:oMath>
+        <m:d>
+          <m:dPr>
+            <m:begChr m:val="{"/>
+            <m:endChr m:val=""/>
+            <m:ctrlPr>
+              <w:rPr>
+                <w:rFonts w:ascii="Cambria Math" w:hAnsi="Cambria Math"/>
+                <w:i/>
+              </w:rPr>
+            </m:ctrlPr>
+          </m:dPr>
+          <m:e>
+            <m:eqArr>
+              <m:eqArrPr>
+                <m:ctrlPr>
+                  <w:rPr>
+                    <w:rFonts w:ascii="Cambria Math" w:hAnsi="Cambria Math"/>
+                    <w:i/>
+                  </w:rPr>
+                </m:ctrlPr>
+              </m:eqArrPr>
+              <m:e>
+                <m:f>
+                  <m:fPr>
+                    <m:ctrlPr>
+                      <w:rPr>
+                        <w:rFonts w:ascii="Cambria Math" w:hAnsi="Cambria Math"/>
+                        <w:i/>
+                      </w:rPr>
+                    </m:ctrlPr>
+                  </m:fPr>
+                  <m:num>
+                    <m:r>
+                      <w:rPr>
+                        <w:rFonts w:ascii="Cambria Math" w:hAnsi="Cambria Math"/>
+                      </w:rPr>
+                      <m:t>ⅆH</m:t>
+                    </m:r>
+                  </m:num>
+                  <m:den>
+                    <m:r>
+                      <w:rPr>
+                        <w:rFonts w:ascii="Cambria Math" w:hAnsi="Cambria Math"/>
+                      </w:rPr>
+                      <m:t>ⅆt</m:t>
+                    </m:r>
+                  </m:den>
+                </m:f>
+                <m:r>
+                  <m:rPr>
+                    <m:sty m:val="p"/>
+                  </m:rPr>
+                  <w:rPr>
+                    <w:rFonts w:ascii="Cambria Math" w:eastAsiaTheme="minorEastAsia" w:hAnsi="Cambria Math"/>
+                  </w:rPr>
+                  <m:t>=</m:t>
+                </m:r>
+                <m:r>
+                  <m:rPr>
+                    <m:sty m:val="p"/>
+                  </m:rPr>
+                  <w:rPr>
+                    <w:rFonts w:ascii="Cambria Math" w:eastAsiaTheme="minorEastAsia" w:hAnsi="Cambria Math"/>
+                  </w:rPr>
+                  <m:t xml:space="preserve"> </m:t>
+                </m:r>
+                <m:r>
+                  <m:rPr>
+                    <m:sty m:val="p"/>
+                  </m:rPr>
+                  <w:rPr>
+                    <w:rFonts w:ascii="Cambria Math" w:hAnsi="Cambria Math"/>
+                  </w:rPr>
+                  <m:t>αH(t) - βH(t) × C(t)</m:t>
+                </m:r>
+                <m:r>
+                  <m:rPr>
+                    <m:sty m:val="p"/>
+                  </m:rPr>
+                  <w:rPr>
+                    <w:rFonts w:ascii="Cambria Math" w:eastAsiaTheme="minorEastAsia" w:hAnsi="Cambria Math"/>
+                  </w:rPr>
+                  <m:t xml:space="preserve">  </m:t>
+                </m:r>
+              </m:e>
+              <m:e>
+                <m:f>
+                  <m:fPr>
+                    <m:ctrlPr>
+                      <w:rPr>
+                        <w:rFonts w:ascii="Cambria Math" w:hAnsi="Cambria Math"/>
+                        <w:i/>
+                      </w:rPr>
+                    </m:ctrlPr>
+                  </m:fPr>
+                  <m:num>
+                    <m:r>
+                      <w:rPr>
+                        <w:rFonts w:ascii="Cambria Math" w:hAnsi="Cambria Math"/>
+                      </w:rPr>
+                      <m:t>ⅆC</m:t>
+                    </m:r>
+                  </m:num>
+                  <m:den>
+                    <m:r>
+                      <w:rPr>
+                        <w:rFonts w:ascii="Cambria Math" w:hAnsi="Cambria Math"/>
+                      </w:rPr>
+                      <m:t>ⅆt</m:t>
+                    </m:r>
+                  </m:den>
+                </m:f>
+                <m:r>
+                  <m:rPr>
+                    <m:sty m:val="p"/>
+                  </m:rPr>
+                  <w:rPr>
+                    <w:rFonts w:ascii="Cambria Math" w:eastAsiaTheme="minorEastAsia" w:hAnsi="Cambria Math"/>
+                  </w:rPr>
+                  <m:t xml:space="preserve">  </m:t>
+                </m:r>
+                <m:r>
+                  <m:rPr>
+                    <m:sty m:val="p"/>
+                  </m:rPr>
+                  <w:rPr>
+                    <w:rFonts w:ascii="Cambria Math" w:eastAsiaTheme="minorEastAsia" w:hAnsi="Cambria Math"/>
+                  </w:rPr>
+                  <m:t xml:space="preserve">= </m:t>
+                </m:r>
+                <m:r>
+                  <m:rPr>
+                    <m:sty m:val="p"/>
+                  </m:rPr>
+                  <w:rPr>
+                    <w:rFonts w:ascii="Cambria Math" w:hAnsi="Cambria Math"/>
+                  </w:rPr>
+                  <m:t xml:space="preserve">-γC(t) + δC(t) × H(t) </m:t>
+                </m:r>
+              </m:e>
+            </m:eqArr>
+          </m:e>
+        </m:d>
+      </m:oMath>
+    </w:p>
+    <w:p>
+      <w:pPr>
+        <w:shd w:val="clear" w:color="auto" w:fill="0F9ED5" w:themeFill="accent4"/>
+      </w:pPr>
+      <w:r>
+        <w:t xml:space="preserve">Les paramètres du modèle sont les suivants : </w:t>
+      </w:r>
+    </w:p>
+    <w:p>
+      <w:pPr>
+        <w:shd w:val="clear" w:color="auto" w:fill="0F9ED5" w:themeFill="accent4"/>
+      </w:pPr>
+      <w:r>
+        <w:t xml:space="preserve">• α : taux de reproduction des proies. </w:t>
+      </w:r>
+    </w:p>
+    <w:p>
+      <w:pPr>
+        <w:shd w:val="clear" w:color="auto" w:fill="0F9ED5" w:themeFill="accent4"/>
+      </w:pPr>
+      <w:r>
+        <w:t xml:space="preserve">• δ : taux de reproduction des prédateurs grâce aux proies consommées. </w:t>
+      </w:r>
+    </w:p>
+    <w:p>
+      <w:pPr>
+        <w:shd w:val="clear" w:color="auto" w:fill="0F9ED5" w:themeFill="accent4"/>
+      </w:pPr>
+      <w:r>
+        <w:lastRenderedPageBreak/>
+        <w:t xml:space="preserve">• β : taux de mortalité des proies due aux prédateurs. </w:t>
+      </w:r>
+    </w:p>
+    <w:p>
+      <w:pPr>
+        <w:shd w:val="clear" w:color="auto" w:fill="0F9ED5" w:themeFill="accent4"/>
+      </w:pPr>
+      <w:r>
+        <w:t>• γ : taux de mortalité naturelle des prédateurs.</w:t>
+      </w:r>
+    </w:p>
+    <w:p/>
+    <w:p>
+      <w:r>
+        <w:t>(1) Quels sont les états d’équilibres statiques des populations ?</w:t>
+      </w:r>
+    </w:p>
+    <w:p>
+      <w:r>
+        <w:t>Population des proies :</w:t>
+      </w:r>
+    </w:p>
+    <w:p>
+      <w:pPr>
+        <w:rPr>
+          <w:sz w:val="32"/>
+          <w:szCs w:val="32"/>
+        </w:rPr>
+      </w:pPr>
+      <w:r>
+        <w:t xml:space="preserve">On cherche les valeurs pour que </w:t>
+      </w:r>
+      <m:oMath>
+        <m:f>
+          <m:fPr>
+            <m:ctrlPr>
+              <w:rPr>
+                <w:rFonts w:ascii="Cambria Math" w:hAnsi="Cambria Math"/>
+                <w:i/>
+                <w:sz w:val="32"/>
+                <w:szCs w:val="32"/>
+              </w:rPr>
+            </m:ctrlPr>
+          </m:fPr>
+          <m:num>
+            <m:r>
+              <w:rPr>
+                <w:rFonts w:ascii="Cambria Math" w:hAnsi="Cambria Math"/>
+                <w:sz w:val="32"/>
+                <w:szCs w:val="32"/>
+              </w:rPr>
+              <m:t>ⅆ</m:t>
+            </m:r>
+            <m:r>
+              <w:rPr>
+                <w:rFonts w:ascii="Cambria Math" w:hAnsi="Cambria Math"/>
+                <w:sz w:val="32"/>
+                <w:szCs w:val="32"/>
+              </w:rPr>
+              <m:t>H</m:t>
+            </m:r>
+          </m:num>
+          <m:den>
+            <m:r>
+              <w:rPr>
+                <w:rFonts w:ascii="Cambria Math" w:hAnsi="Cambria Math"/>
+                <w:sz w:val="32"/>
+                <w:szCs w:val="32"/>
+              </w:rPr>
+              <m:t>ⅆt</m:t>
+            </m:r>
+          </m:den>
+        </m:f>
+      </m:oMath>
+      <w:r>
+        <w:rPr>
+          <w:rFonts w:eastAsiaTheme="minorEastAsia"/>
+          <w:sz w:val="32"/>
+          <w:szCs w:val="32"/>
+        </w:rPr>
+        <w:t xml:space="preserve">  </w:t>
+      </w:r>
+      <w:r>
+        <w:rPr>
+          <w:sz w:val="32"/>
+          <w:szCs w:val="32"/>
+        </w:rPr>
+        <w:t>=</w:t>
+      </w:r>
+      <w:r>
+        <w:rPr>
+          <w:sz w:val="32"/>
+          <w:szCs w:val="32"/>
+        </w:rPr>
+        <w:t xml:space="preserve"> 0.</w:t>
+      </w:r>
+    </w:p>
+    <w:p>
+      <w:pPr>
+        <w:rPr>
+          <w:rFonts w:ascii="Cambria Math" w:eastAsiaTheme="minorEastAsia" w:hAnsi="Cambria Math"/>
+        </w:rPr>
+      </w:pPr>
+      <m:oMath>
+        <m:f>
+          <m:fPr>
+            <m:ctrlPr>
+              <w:rPr>
+                <w:rFonts w:ascii="Cambria Math" w:hAnsi="Cambria Math"/>
+                <w:i/>
+                <w:sz w:val="32"/>
+                <w:szCs w:val="32"/>
+              </w:rPr>
+            </m:ctrlPr>
+          </m:fPr>
+          <m:num>
+            <m:r>
+              <w:rPr>
+                <w:rFonts w:ascii="Cambria Math" w:hAnsi="Cambria Math"/>
+                <w:sz w:val="32"/>
+                <w:szCs w:val="32"/>
+              </w:rPr>
+              <m:t>ⅆ</m:t>
+            </m:r>
+            <m:r>
+              <w:rPr>
+                <w:rFonts w:ascii="Cambria Math" w:hAnsi="Cambria Math"/>
+                <w:sz w:val="32"/>
+                <w:szCs w:val="32"/>
+              </w:rPr>
+              <m:t>P</m:t>
+            </m:r>
+          </m:num>
+          <m:den>
+            <m:r>
+              <w:rPr>
+                <w:rFonts w:ascii="Cambria Math" w:hAnsi="Cambria Math"/>
+                <w:sz w:val="32"/>
+                <w:szCs w:val="32"/>
+              </w:rPr>
+              <m:t>ⅆ</m:t>
+            </m:r>
+            <m:r>
+              <w:rPr>
+                <w:rFonts w:ascii="Cambria Math" w:hAnsi="Cambria Math"/>
+                <w:sz w:val="32"/>
+                <w:szCs w:val="32"/>
+              </w:rPr>
+              <m:t>t</m:t>
+            </m:r>
+          </m:den>
+        </m:f>
+      </m:oMath>
+      <w:r>
+        <w:rPr>
+          <w:rFonts w:eastAsiaTheme="minorEastAsia"/>
+          <w:sz w:val="32"/>
+          <w:szCs w:val="32"/>
+        </w:rPr>
+        <w:t xml:space="preserve">  </w:t>
+      </w:r>
+      <w:r>
+        <w:rPr>
+          <w:sz w:val="32"/>
+          <w:szCs w:val="32"/>
+        </w:rPr>
+        <w:t xml:space="preserve">= </w:t>
+      </w:r>
+      <m:oMath>
+        <m:r>
+          <m:rPr>
+            <m:sty m:val="p"/>
+          </m:rPr>
+          <w:rPr>
+            <w:rFonts w:ascii="Cambria Math" w:hAnsi="Cambria Math"/>
+          </w:rPr>
+          <m:t>α</m:t>
+        </m:r>
+        <m:r>
+          <m:rPr>
+            <m:sty m:val="p"/>
+          </m:rPr>
+          <w:rPr>
+            <w:rFonts w:ascii="Cambria Math" w:hAnsi="Cambria Math"/>
+          </w:rPr>
+          <m:t xml:space="preserve">H(t) - </m:t>
+        </m:r>
+        <m:r>
+          <m:rPr>
+            <m:sty m:val="p"/>
+          </m:rPr>
+          <w:rPr>
+            <w:rFonts w:ascii="Cambria Math" w:hAnsi="Cambria Math"/>
+          </w:rPr>
+          <m:t>β</m:t>
+        </m:r>
+        <m:r>
+          <m:rPr>
+            <m:sty m:val="p"/>
+          </m:rPr>
+          <w:rPr>
+            <w:rFonts w:ascii="Cambria Math" w:hAnsi="Cambria Math"/>
+          </w:rPr>
+          <m:t>H(t) × C(t)</m:t>
+        </m:r>
+        <m:r>
+          <m:rPr>
+            <m:sty m:val="p"/>
+          </m:rPr>
+          <w:rPr>
+            <w:rFonts w:ascii="Cambria Math" w:eastAsiaTheme="minorEastAsia" w:hAnsi="Cambria Math"/>
+          </w:rPr>
+          <m:t xml:space="preserve"> </m:t>
+        </m:r>
+      </m:oMath>
+      <w:r>
+        <w:rPr>
+          <w:rFonts w:eastAsiaTheme="minorEastAsia"/>
+        </w:rPr>
+        <w:t>, don</w:t>
+      </w:r>
+      <w:r>
+        <w:rPr>
+          <w:rFonts w:eastAsiaTheme="minorEastAsia"/>
+        </w:rPr>
+        <w:t xml:space="preserve">c </w:t>
+      </w:r>
+      <m:oMath>
+        <m:f>
+          <m:fPr>
+            <m:ctrlPr>
+              <w:rPr>
+                <w:rFonts w:ascii="Cambria Math" w:hAnsi="Cambria Math"/>
+                <w:i/>
+                <w:sz w:val="32"/>
+                <w:szCs w:val="32"/>
+              </w:rPr>
+            </m:ctrlPr>
+          </m:fPr>
+          <m:num>
+            <m:r>
+              <w:rPr>
+                <w:rFonts w:ascii="Cambria Math" w:hAnsi="Cambria Math"/>
+                <w:sz w:val="32"/>
+                <w:szCs w:val="32"/>
+              </w:rPr>
+              <m:t>ⅆ</m:t>
+            </m:r>
+            <m:r>
+              <w:rPr>
+                <w:rFonts w:ascii="Cambria Math" w:hAnsi="Cambria Math"/>
+                <w:sz w:val="32"/>
+                <w:szCs w:val="32"/>
+              </w:rPr>
+              <m:t>P</m:t>
+            </m:r>
+          </m:num>
+          <m:den>
+            <m:r>
+              <w:rPr>
+                <w:rFonts w:ascii="Cambria Math" w:hAnsi="Cambria Math"/>
+                <w:sz w:val="32"/>
+                <w:szCs w:val="32"/>
+              </w:rPr>
+              <m:t>ⅆ</m:t>
+            </m:r>
+            <m:r>
+              <w:rPr>
+                <w:rFonts w:ascii="Cambria Math" w:hAnsi="Cambria Math"/>
+                <w:sz w:val="32"/>
+                <w:szCs w:val="32"/>
+              </w:rPr>
+              <m:t>t</m:t>
+            </m:r>
+          </m:den>
+        </m:f>
+      </m:oMath>
+      <w:r>
+        <w:rPr>
+          <w:rFonts w:eastAsiaTheme="minorEastAsia"/>
+          <w:sz w:val="32"/>
+          <w:szCs w:val="32"/>
+        </w:rPr>
+        <w:t xml:space="preserve"> </w:t>
+      </w:r>
+      <w:r>
+        <w:rPr>
+          <w:rFonts w:eastAsiaTheme="minorEastAsia"/>
+        </w:rPr>
+        <w:t>= 0</w:t>
+      </w:r>
+      <w:r>
+        <w:rPr>
+          <w:rFonts w:eastAsiaTheme="minorEastAsia"/>
+        </w:rPr>
+        <w:t xml:space="preserve"> </w:t>
+      </w:r>
+      <w:r>
+        <w:rPr>
+          <w:rFonts w:eastAsiaTheme="minorEastAsia"/>
+        </w:rPr>
+        <w:sym w:font="Wingdings" w:char="F0F3"/>
+      </w:r>
+      <w:r>
+        <w:rPr>
+          <w:rFonts w:eastAsiaTheme="minorEastAsia"/>
+        </w:rPr>
+        <w:t xml:space="preserve"> </w:t>
+      </w:r>
+      <m:oMath>
+        <m:r>
+          <m:rPr>
+            <m:sty m:val="p"/>
+          </m:rPr>
+          <w:rPr>
+            <w:rFonts w:ascii="Cambria Math" w:hAnsi="Cambria Math"/>
+          </w:rPr>
+          <m:t>α</m:t>
+        </m:r>
+        <m:r>
+          <m:rPr>
+            <m:sty m:val="p"/>
+          </m:rPr>
+          <w:rPr>
+            <w:rFonts w:ascii="Cambria Math" w:hAnsi="Cambria Math"/>
+          </w:rPr>
+          <m:t xml:space="preserve">H(t) - </m:t>
+        </m:r>
+        <m:r>
+          <m:rPr>
+            <m:sty m:val="p"/>
+          </m:rPr>
+          <w:rPr>
+            <w:rFonts w:ascii="Cambria Math" w:hAnsi="Cambria Math"/>
+          </w:rPr>
+          <m:t>β</m:t>
+        </m:r>
+        <m:r>
+          <m:rPr>
+            <m:sty m:val="p"/>
+          </m:rPr>
+          <w:rPr>
+            <w:rFonts w:ascii="Cambria Math" w:hAnsi="Cambria Math"/>
+          </w:rPr>
+          <m:t>H(t) × C(t)</m:t>
+        </m:r>
+      </m:oMath>
+      <w:r>
+        <w:rPr>
+          <w:rFonts w:eastAsiaTheme="minorEastAsia"/>
+        </w:rPr>
+        <w:t xml:space="preserve"> = 0</w:t>
+      </w:r>
+      <w:r>
+        <w:rPr>
+          <w:rFonts w:eastAsiaTheme="minorEastAsia"/>
+        </w:rPr>
+        <w:t xml:space="preserve"> </w:t>
+      </w:r>
+      <w:r>
+        <w:rPr>
+          <w:rFonts w:eastAsiaTheme="minorEastAsia"/>
+        </w:rPr>
+        <w:sym w:font="Wingdings" w:char="F0F3"/>
+      </w:r>
+      <m:oMath>
+        <m:r>
+          <m:rPr>
+            <m:sty m:val="p"/>
+          </m:rPr>
+          <w:rPr>
+            <w:rFonts w:ascii="Cambria Math" w:hAnsi="Cambria Math"/>
+          </w:rPr>
+          <m:t xml:space="preserve">- </m:t>
+        </m:r>
+        <m:r>
+          <m:rPr>
+            <m:sty m:val="p"/>
+          </m:rPr>
+          <w:rPr>
+            <w:rFonts w:ascii="Cambria Math" w:hAnsi="Cambria Math"/>
+          </w:rPr>
+          <m:t>β</m:t>
+        </m:r>
+        <m:r>
+          <m:rPr>
+            <m:sty m:val="p"/>
+          </m:rPr>
+          <w:rPr>
+            <w:rFonts w:ascii="Cambria Math" w:hAnsi="Cambria Math"/>
+          </w:rPr>
+          <m:t>H(t) × C(t)</m:t>
+        </m:r>
+      </m:oMath>
+      <w:r>
+        <w:rPr>
+          <w:rFonts w:eastAsiaTheme="minorEastAsia"/>
+        </w:rPr>
+        <w:t xml:space="preserve"> = -</w:t>
+      </w:r>
+      <w:r>
+        <w:rPr>
+          <w:rFonts w:ascii="Cambria Math" w:hAnsi="Cambria Math"/>
+        </w:rPr>
+        <w:t xml:space="preserve"> </w:t>
+      </w:r>
+      <m:oMath>
+        <m:r>
+          <m:rPr>
+            <m:sty m:val="p"/>
+          </m:rPr>
+          <w:rPr>
+            <w:rFonts w:ascii="Cambria Math" w:hAnsi="Cambria Math"/>
+          </w:rPr>
+          <m:t>α</m:t>
+        </m:r>
+        <m:r>
+          <m:rPr>
+            <m:sty m:val="p"/>
+          </m:rPr>
+          <w:rPr>
+            <w:rFonts w:ascii="Cambria Math" w:hAnsi="Cambria Math"/>
+          </w:rPr>
+          <m:t>H(t)</m:t>
+        </m:r>
+      </m:oMath>
+      <w:r>
+        <w:rPr>
+          <w:rFonts w:ascii="Cambria Math" w:eastAsiaTheme="minorEastAsia" w:hAnsi="Cambria Math"/>
+        </w:rPr>
+        <w:t xml:space="preserve"> </w:t>
+      </w:r>
+      <w:r>
+        <w:rPr>
+          <w:rFonts w:ascii="Cambria Math" w:eastAsiaTheme="minorEastAsia" w:hAnsi="Cambria Math"/>
+        </w:rPr>
+        <w:sym w:font="Wingdings" w:char="F0F3"/>
+      </w:r>
+      <w:r>
+        <w:rPr>
+          <w:rFonts w:ascii="Cambria Math" w:hAnsi="Cambria Math"/>
+        </w:rPr>
+        <w:t xml:space="preserve"> </w:t>
+      </w:r>
+      <m:oMath>
+        <m:r>
+          <m:rPr>
+            <m:sty m:val="p"/>
+          </m:rPr>
+          <w:rPr>
+            <w:rFonts w:ascii="Cambria Math" w:hAnsi="Cambria Math"/>
+          </w:rPr>
+          <m:t>C(t)</m:t>
+        </m:r>
+      </m:oMath>
+      <w:r>
+        <w:rPr>
+          <w:rFonts w:ascii="Cambria Math" w:eastAsiaTheme="minorEastAsia" w:hAnsi="Cambria Math"/>
+        </w:rPr>
+        <w:t xml:space="preserve"> = </w:t>
+      </w:r>
+      <w:r>
+        <w:rPr>
+          <w:rFonts w:eastAsiaTheme="minorEastAsia"/>
+        </w:rPr>
+        <w:t>-</w:t>
+      </w:r>
+      <w:r>
+        <w:rPr>
+          <w:rFonts w:ascii="Cambria Math" w:hAnsi="Cambria Math"/>
+        </w:rPr>
+        <w:t xml:space="preserve"> </w:t>
+      </w:r>
+      <m:oMath>
+        <m:r>
+          <m:rPr>
+            <m:sty m:val="p"/>
+          </m:rPr>
+          <w:rPr>
+            <w:rFonts w:ascii="Cambria Math" w:hAnsi="Cambria Math"/>
+          </w:rPr>
+          <m:t>α</m:t>
+        </m:r>
+        <m:r>
+          <m:rPr>
+            <m:sty m:val="p"/>
+          </m:rPr>
+          <w:rPr>
+            <w:rFonts w:ascii="Cambria Math" w:hAnsi="Cambria Math"/>
+          </w:rPr>
+          <m:t>H(t)</m:t>
+        </m:r>
+      </m:oMath>
+      <w:r>
+        <w:rPr>
+          <w:rFonts w:ascii="Cambria Math" w:eastAsiaTheme="minorEastAsia" w:hAnsi="Cambria Math"/>
+        </w:rPr>
+        <w:t xml:space="preserve"> + </w:t>
+      </w:r>
+      <m:oMath>
+        <m:r>
+          <m:rPr>
+            <m:sty m:val="p"/>
+          </m:rPr>
+          <w:rPr>
+            <w:rFonts w:ascii="Cambria Math" w:hAnsi="Cambria Math"/>
+          </w:rPr>
+          <m:t>β</m:t>
+        </m:r>
+        <m:r>
+          <m:rPr>
+            <m:sty m:val="p"/>
+          </m:rPr>
+          <w:rPr>
+            <w:rFonts w:ascii="Cambria Math" w:hAnsi="Cambria Math"/>
+          </w:rPr>
+          <m:t>H(t)</m:t>
+        </m:r>
+      </m:oMath>
+    </w:p>
+    <w:p>
+      <w:pPr>
+        <w:rPr>
+          <w:rFonts w:ascii="Cambria Math" w:eastAsiaTheme="minorEastAsia" w:hAnsi="Cambria Math"/>
+        </w:rPr>
+      </w:pPr>
+    </w:p>
+    <w:p>
+      <w:pPr>
+        <w:rPr>
+          <w:sz w:val="32"/>
+          <w:szCs w:val="32"/>
+        </w:rPr>
+      </w:pPr>
+      <w:r>
+        <w:t xml:space="preserve">On cherche les valeurs pour que </w:t>
+      </w:r>
+      <m:oMath>
+        <m:f>
+          <m:fPr>
+            <m:ctrlPr>
+              <w:rPr>
+                <w:rFonts w:ascii="Cambria Math" w:hAnsi="Cambria Math"/>
+                <w:i/>
+                <w:sz w:val="32"/>
+                <w:szCs w:val="32"/>
+              </w:rPr>
+            </m:ctrlPr>
+          </m:fPr>
+          <m:num>
+            <m:r>
+              <w:rPr>
+                <w:rFonts w:ascii="Cambria Math" w:hAnsi="Cambria Math"/>
+                <w:sz w:val="32"/>
+                <w:szCs w:val="32"/>
+              </w:rPr>
+              <m:t>ⅆ</m:t>
+            </m:r>
+            <m:r>
+              <w:rPr>
+                <w:rFonts w:ascii="Cambria Math" w:hAnsi="Cambria Math"/>
+                <w:sz w:val="32"/>
+                <w:szCs w:val="32"/>
+              </w:rPr>
+              <m:t>C</m:t>
+            </m:r>
+          </m:num>
+          <m:den>
+            <m:r>
+              <w:rPr>
+                <w:rFonts w:ascii="Cambria Math" w:hAnsi="Cambria Math"/>
+                <w:sz w:val="32"/>
+                <w:szCs w:val="32"/>
+              </w:rPr>
+              <m:t>ⅆt</m:t>
+            </m:r>
+          </m:den>
+        </m:f>
+      </m:oMath>
+      <w:r>
+        <w:rPr>
+          <w:rFonts w:eastAsiaTheme="minorEastAsia"/>
+          <w:sz w:val="32"/>
+          <w:szCs w:val="32"/>
+        </w:rPr>
+        <w:t xml:space="preserve">  </w:t>
+      </w:r>
+      <w:r>
+        <w:rPr>
+          <w:sz w:val="32"/>
+          <w:szCs w:val="32"/>
+        </w:rPr>
+        <w:t>=</w:t>
+      </w:r>
+      <w:r>
+        <w:rPr>
+          <w:sz w:val="32"/>
+          <w:szCs w:val="32"/>
+        </w:rPr>
+        <w:t xml:space="preserve"> 0.</w:t>
+      </w:r>
+    </w:p>
+    <w:p>
+      <w:pPr>
+        <w:rPr>
+          <w:sz w:val="32"/>
+          <w:szCs w:val="32"/>
+        </w:rPr>
+      </w:pPr>
+      <m:oMath>
+        <m:f>
+          <m:fPr>
+            <m:ctrlPr>
+              <w:rPr>
+                <w:rFonts w:ascii="Cambria Math" w:hAnsi="Cambria Math"/>
+                <w:i/>
+                <w:sz w:val="32"/>
+                <w:szCs w:val="32"/>
+              </w:rPr>
+            </m:ctrlPr>
+          </m:fPr>
+          <m:num>
+            <m:r>
+              <w:rPr>
+                <w:rFonts w:ascii="Cambria Math" w:hAnsi="Cambria Math"/>
+                <w:sz w:val="32"/>
+                <w:szCs w:val="32"/>
+              </w:rPr>
+              <m:t>ⅆ</m:t>
+            </m:r>
+            <m:r>
+              <w:rPr>
+                <w:rFonts w:ascii="Cambria Math" w:hAnsi="Cambria Math"/>
+                <w:sz w:val="32"/>
+                <w:szCs w:val="32"/>
+              </w:rPr>
+              <m:t>H</m:t>
+            </m:r>
+          </m:num>
+          <m:den>
+            <m:r>
+              <w:rPr>
+                <w:rFonts w:ascii="Cambria Math" w:hAnsi="Cambria Math"/>
+                <w:sz w:val="32"/>
+                <w:szCs w:val="32"/>
+              </w:rPr>
+              <m:t>ⅆ</m:t>
+            </m:r>
+            <m:r>
+              <w:rPr>
+                <w:rFonts w:ascii="Cambria Math" w:hAnsi="Cambria Math"/>
+                <w:sz w:val="32"/>
+                <w:szCs w:val="32"/>
+              </w:rPr>
+              <m:t>t</m:t>
+            </m:r>
+          </m:den>
+        </m:f>
+      </m:oMath>
+      <w:r>
+        <w:rPr>
+          <w:rFonts w:eastAsiaTheme="minorEastAsia"/>
+          <w:sz w:val="32"/>
+          <w:szCs w:val="32"/>
+        </w:rPr>
+        <w:t xml:space="preserve">  </w:t>
+      </w:r>
+      <w:r>
+        <w:rPr>
+          <w:sz w:val="32"/>
+          <w:szCs w:val="32"/>
+        </w:rPr>
+        <w:t>=</w:t>
+      </w:r>
+      <w:r>
+        <w:rPr>
+          <w:sz w:val="32"/>
+          <w:szCs w:val="32"/>
+        </w:rPr>
+        <w:t xml:space="preserve"> </w:t>
+      </w:r>
+      <m:oMath>
+        <m:r>
+          <m:rPr>
+            <m:sty m:val="p"/>
+          </m:rPr>
+          <w:rPr>
+            <w:rFonts w:ascii="Cambria Math" w:hAnsi="Cambria Math"/>
+          </w:rPr>
+          <m:t>-</m:t>
+        </m:r>
+        <m:r>
+          <m:rPr>
+            <m:sty m:val="p"/>
+          </m:rPr>
+          <w:rPr>
+            <w:rFonts w:ascii="Cambria Math" w:hAnsi="Cambria Math"/>
+          </w:rPr>
+          <m:t>γ</m:t>
+        </m:r>
+        <m:r>
+          <m:rPr>
+            <m:sty m:val="p"/>
+          </m:rPr>
+          <w:rPr>
+            <w:rFonts w:ascii="Cambria Math" w:hAnsi="Cambria Math"/>
+          </w:rPr>
+          <m:t xml:space="preserve">C(t) + </m:t>
+        </m:r>
+        <m:r>
+          <m:rPr>
+            <m:sty m:val="p"/>
+          </m:rPr>
+          <w:rPr>
+            <w:rFonts w:ascii="Cambria Math" w:hAnsi="Cambria Math"/>
+          </w:rPr>
+          <m:t>δ</m:t>
+        </m:r>
+        <m:r>
+          <m:rPr>
+            <m:sty m:val="p"/>
+          </m:rPr>
+          <w:rPr>
+            <w:rFonts w:ascii="Cambria Math" w:hAnsi="Cambria Math"/>
+          </w:rPr>
+          <m:t>C(t) × H(t)</m:t>
+        </m:r>
+      </m:oMath>
+      <w:r>
+        <w:rPr>
+          <w:rFonts w:eastAsiaTheme="minorEastAsia"/>
+        </w:rPr>
+        <w:t>, don</w:t>
+      </w:r>
+      <w:r>
+        <w:rPr>
+          <w:rFonts w:eastAsiaTheme="minorEastAsia"/>
+        </w:rPr>
+        <w:t xml:space="preserve">c </w:t>
+      </w:r>
+      <m:oMath>
+        <m:f>
+          <m:fPr>
+            <m:ctrlPr>
+              <w:rPr>
+                <w:rFonts w:ascii="Cambria Math" w:hAnsi="Cambria Math"/>
+                <w:i/>
+                <w:sz w:val="32"/>
+                <w:szCs w:val="32"/>
+              </w:rPr>
+            </m:ctrlPr>
+          </m:fPr>
+          <m:num>
+            <m:r>
+              <w:rPr>
+                <w:rFonts w:ascii="Cambria Math" w:hAnsi="Cambria Math"/>
+                <w:sz w:val="32"/>
+                <w:szCs w:val="32"/>
+              </w:rPr>
+              <m:t>ⅆ</m:t>
+            </m:r>
+            <m:r>
+              <w:rPr>
+                <w:rFonts w:ascii="Cambria Math" w:hAnsi="Cambria Math"/>
+                <w:sz w:val="32"/>
+                <w:szCs w:val="32"/>
+              </w:rPr>
+              <m:t>H</m:t>
+            </m:r>
+          </m:num>
+          <m:den>
+            <m:r>
+              <w:rPr>
+                <w:rFonts w:ascii="Cambria Math" w:hAnsi="Cambria Math"/>
+                <w:sz w:val="32"/>
+                <w:szCs w:val="32"/>
+              </w:rPr>
+              <m:t>ⅆ</m:t>
+            </m:r>
+            <m:r>
+              <w:rPr>
+                <w:rFonts w:ascii="Cambria Math" w:hAnsi="Cambria Math"/>
+                <w:sz w:val="32"/>
+                <w:szCs w:val="32"/>
+              </w:rPr>
+              <m:t>t</m:t>
+            </m:r>
+          </m:den>
+        </m:f>
+      </m:oMath>
+      <w:r>
+        <w:rPr>
+          <w:rFonts w:eastAsiaTheme="minorEastAsia"/>
+          <w:sz w:val="32"/>
+          <w:szCs w:val="32"/>
+        </w:rPr>
+        <w:t xml:space="preserve"> </w:t>
+      </w:r>
+      <w:r>
+        <w:rPr>
+          <w:rFonts w:eastAsiaTheme="minorEastAsia"/>
+        </w:rPr>
+        <w:t>= 0</w:t>
+      </w:r>
+      <w:r>
+        <w:rPr>
+          <w:rFonts w:eastAsiaTheme="minorEastAsia"/>
+        </w:rPr>
+        <w:t xml:space="preserve"> </w:t>
+      </w:r>
+      <w:r>
+        <w:rPr>
+          <w:rFonts w:eastAsiaTheme="minorEastAsia"/>
+        </w:rPr>
+        <w:sym w:font="Wingdings" w:char="F0F3"/>
+      </w:r>
+      <m:oMath>
+        <m:r>
+          <m:rPr>
+            <m:sty m:val="p"/>
+          </m:rPr>
+          <w:rPr>
+            <w:rFonts w:ascii="Cambria Math" w:hAnsi="Cambria Math"/>
+          </w:rPr>
+          <m:t>-γC(t) + δC(t) × H(t)</m:t>
+        </m:r>
+      </m:oMath>
+      <w:r>
+        <w:rPr>
+          <w:rFonts w:eastAsiaTheme="minorEastAsia"/>
+        </w:rPr>
+        <w:t xml:space="preserve"> = 0 </w:t>
+      </w:r>
+      <w:r>
+        <w:rPr>
+          <w:rFonts w:eastAsiaTheme="minorEastAsia"/>
+        </w:rPr>
+        <w:sym w:font="Wingdings" w:char="F0F3"/>
+      </w:r>
+    </w:p>
+    <w:p>
+      <w:pPr>
+        <w:rPr>
+          <w:sz w:val="32"/>
+          <w:szCs w:val="32"/>
+        </w:rPr>
+      </w:pPr>
+    </w:p>
+    <w:p>
+      <w:pPr>
+        <w:rPr>
+          <w:sz w:val="32"/>
+          <w:szCs w:val="32"/>
+        </w:rPr>
+      </w:pPr>
+    </w:p>
+    <w:p/>
     <w:sectPr>
       <w:pgSz w:w="11906" w:h="16838"/>
       <w:pgMar w:top="1417" w:right="1417" w:bottom="1417" w:left="1417" w:header="708" w:footer="708" w:gutter="0"/>
@@ -1265,6 +2739,127 @@
     </w:sectPr>
   </w:body>
 </w:document>
+</file>
+
+<file path=word/numbering.xml><?xml version="1.0" encoding="utf-8"?>
+<w:numbering xmlns:wpc="http://schemas.microsoft.com/office/word/2010/wordprocessingCanvas" xmlns:cx="http://schemas.microsoft.com/office/drawing/2014/chartex" xmlns:cx1="http://schemas.microsoft.com/office/drawing/2015/9/8/chartex" xmlns:cx2="http://schemas.microsoft.com/office/drawing/2015/10/21/chartex" xmlns:cx3="http://schemas.microsoft.com/office/drawing/2016/5/9/chartex" xmlns:cx4="http://schemas.microsoft.com/office/drawing/2016/5/10/chartex" xmlns:cx5="http://schemas.microsoft.com/office/drawing/2016/5/11/chartex" xmlns:cx6="http://schemas.microsoft.com/office/drawing/2016/5/12/chartex" xmlns:cx7="http://schemas.microsoft.com/office/drawing/2016/5/13/chartex" xmlns:cx8="http://schemas.microsoft.com/office/drawing/2016/5/14/chartex" xmlns:mc="http://schemas.openxmlformats.org/markup-compatibility/2006" xmlns:aink="http://schemas.microsoft.com/office/drawing/2016/ink" xmlns:am3d="http://schemas.microsoft.com/office/drawing/2017/model3d" xmlns:o="urn:schemas-microsoft-com:office:office" xmlns:oel="http://schemas.microsoft.com/office/2019/extlst" xmlns:r="http://schemas.openxmlformats.org/officeDocument/2006/relationships" xmlns:m="http://schemas.openxmlformats.org/officeDocument/2006/math" xmlns:v="urn:schemas-microsoft-com:vml" xmlns:wp14="http://schemas.microsoft.com/office/word/2010/wordprocessingDrawing" xmlns:wp="http://schemas.openxmlformats.org/drawingml/2006/wordprocessingDrawing" xmlns:w10="urn:schemas-microsoft-com:office:word" xmlns:w="http://schemas.openxmlformats.org/wordprocessingml/2006/main" xmlns:w14="http://schemas.microsoft.com/office/word/2010/wordml" xmlns:w15="http://schemas.microsoft.com/office/word/2012/wordml" xmlns:w16cex="http://schemas.microsoft.com/office/word/2018/wordml/cex" xmlns:w16cid="http://schemas.microsoft.com/office/word/2016/wordml/cid" xmlns:w16="http://schemas.microsoft.com/office/word/2018/wordml" xmlns:w16du="http://schemas.microsoft.com/office/word/2023/wordml/word16du" xmlns:w16sdtdh="http://schemas.microsoft.com/office/word/2020/wordml/sdtdatahash" xmlns:w16sdtfl="http://schemas.microsoft.com/office/word/2024/wordml/sdtformatlock" xmlns:w16se="http://schemas.microsoft.com/office/word/2015/wordml/symex" xmlns:wpg="http://schemas.microsoft.com/office/word/2010/wordprocessingGroup" xmlns:wpi="http://schemas.microsoft.com/office/word/2010/wordprocessingInk" xmlns:wne="http://schemas.microsoft.com/office/word/2006/wordml" xmlns:wps="http://schemas.microsoft.com/office/word/2010/wordprocessingShape" mc:Ignorable="w14 w15 w16se w16cid w16 w16cex w16sdtdh w16sdtfl w16du wp14">
+  <w:abstractNum w:abstractNumId="0" w15:restartNumberingAfterBreak="0">
+    <w:nsid w:val="438B6BC1"/>
+    <w:multiLevelType w:val="hybridMultilevel"/>
+    <w:tmpl w:val="B5A869F2"/>
+    <w:lvl w:ilvl="0" w:tplc="671049C0">
+      <w:start w:val="2"/>
+      <w:numFmt w:val="bullet"/>
+      <w:lvlText w:val="-"/>
+      <w:lvlJc w:val="left"/>
+      <w:pPr>
+        <w:ind w:left="720" w:hanging="360"/>
+      </w:pPr>
+      <w:rPr>
+        <w:rFonts w:ascii="Aptos" w:eastAsiaTheme="minorHAnsi" w:hAnsi="Aptos" w:cstheme="minorBidi" w:hint="default"/>
+      </w:rPr>
+    </w:lvl>
+    <w:lvl w:ilvl="1" w:tplc="040C0003" w:tentative="1">
+      <w:start w:val="1"/>
+      <w:numFmt w:val="bullet"/>
+      <w:lvlText w:val="o"/>
+      <w:lvlJc w:val="left"/>
+      <w:pPr>
+        <w:ind w:left="1440" w:hanging="360"/>
+      </w:pPr>
+      <w:rPr>
+        <w:rFonts w:ascii="Courier New" w:hAnsi="Courier New" w:cs="Courier New" w:hint="default"/>
+      </w:rPr>
+    </w:lvl>
+    <w:lvl w:ilvl="2" w:tplc="040C0005" w:tentative="1">
+      <w:start w:val="1"/>
+      <w:numFmt w:val="bullet"/>
+      <w:lvlText w:val=""/>
+      <w:lvlJc w:val="left"/>
+      <w:pPr>
+        <w:ind w:left="2160" w:hanging="360"/>
+      </w:pPr>
+      <w:rPr>
+        <w:rFonts w:ascii="Wingdings" w:hAnsi="Wingdings" w:hint="default"/>
+      </w:rPr>
+    </w:lvl>
+    <w:lvl w:ilvl="3" w:tplc="040C0001" w:tentative="1">
+      <w:start w:val="1"/>
+      <w:numFmt w:val="bullet"/>
+      <w:lvlText w:val=""/>
+      <w:lvlJc w:val="left"/>
+      <w:pPr>
+        <w:ind w:left="2880" w:hanging="360"/>
+      </w:pPr>
+      <w:rPr>
+        <w:rFonts w:ascii="Symbol" w:hAnsi="Symbol" w:hint="default"/>
+      </w:rPr>
+    </w:lvl>
+    <w:lvl w:ilvl="4" w:tplc="040C0003" w:tentative="1">
+      <w:start w:val="1"/>
+      <w:numFmt w:val="bullet"/>
+      <w:lvlText w:val="o"/>
+      <w:lvlJc w:val="left"/>
+      <w:pPr>
+        <w:ind w:left="3600" w:hanging="360"/>
+      </w:pPr>
+      <w:rPr>
+        <w:rFonts w:ascii="Courier New" w:hAnsi="Courier New" w:cs="Courier New" w:hint="default"/>
+      </w:rPr>
+    </w:lvl>
+    <w:lvl w:ilvl="5" w:tplc="040C0005" w:tentative="1">
+      <w:start w:val="1"/>
+      <w:numFmt w:val="bullet"/>
+      <w:lvlText w:val=""/>
+      <w:lvlJc w:val="left"/>
+      <w:pPr>
+        <w:ind w:left="4320" w:hanging="360"/>
+      </w:pPr>
+      <w:rPr>
+        <w:rFonts w:ascii="Wingdings" w:hAnsi="Wingdings" w:hint="default"/>
+      </w:rPr>
+    </w:lvl>
+    <w:lvl w:ilvl="6" w:tplc="040C0001" w:tentative="1">
+      <w:start w:val="1"/>
+      <w:numFmt w:val="bullet"/>
+      <w:lvlText w:val=""/>
+      <w:lvlJc w:val="left"/>
+      <w:pPr>
+        <w:ind w:left="5040" w:hanging="360"/>
+      </w:pPr>
+      <w:rPr>
+        <w:rFonts w:ascii="Symbol" w:hAnsi="Symbol" w:hint="default"/>
+      </w:rPr>
+    </w:lvl>
+    <w:lvl w:ilvl="7" w:tplc="040C0003" w:tentative="1">
+      <w:start w:val="1"/>
+      <w:numFmt w:val="bullet"/>
+      <w:lvlText w:val="o"/>
+      <w:lvlJc w:val="left"/>
+      <w:pPr>
+        <w:ind w:left="5760" w:hanging="360"/>
+      </w:pPr>
+      <w:rPr>
+        <w:rFonts w:ascii="Courier New" w:hAnsi="Courier New" w:cs="Courier New" w:hint="default"/>
+      </w:rPr>
+    </w:lvl>
+    <w:lvl w:ilvl="8" w:tplc="040C0005" w:tentative="1">
+      <w:start w:val="1"/>
+      <w:numFmt w:val="bullet"/>
+      <w:lvlText w:val=""/>
+      <w:lvlJc w:val="left"/>
+      <w:pPr>
+        <w:ind w:left="6480" w:hanging="360"/>
+      </w:pPr>
+      <w:rPr>
+        <w:rFonts w:ascii="Wingdings" w:hAnsi="Wingdings" w:hint="default"/>
+      </w:rPr>
+    </w:lvl>
+  </w:abstractNum>
+  <w:num w:numId="1" w16cid:durableId="52043241">
+    <w:abstractNumId w:val="0"/>
+  </w:num>
+</w:numbering>
 </file>
 
 <file path=word/styles.xml><?xml version="1.0" encoding="utf-8"?>
@@ -2183,6 +3778,16 @@
       <w:spacing w:val="5"/>
     </w:rPr>
   </w:style>
+  <w:style w:type="character" w:styleId="Textedelespacerserv">
+    <w:name w:val="Placeholder Text"/>
+    <w:basedOn w:val="Policepardfaut"/>
+    <w:uiPriority w:val="99"/>
+    <w:semiHidden/>
+    <w:rsid w:val="006A2A17"/>
+    <w:rPr>
+      <w:color w:val="666666"/>
+    </w:rPr>
+  </w:style>
 </w:styles>
 </file>
 

</xml_diff>